<commit_message>
Add the mobile before/after pair and a reproducibility appendix
- Figures 12 and 13: the Incidents table on mobile, in its defective
  state as seen during the manual review and after the fix. The closing
  of phase 6 now gets its own page: the account, the visual proof, then
  the lesson.
- Appendix C, "Reproduire les preuves": the exact commands that produced
  the versioned evidence logs — application and tests, Ansible
  deployment and idempotence, storage persistence, the provoked outage
  and its alert, backup and restore, plus the public CI run URL. It
  turns the dossier's central claim, that everything is replayable, into
  something the jury can act on, and it answers the REAC criterion "les
  scripts sont documentés" for the mandatory CP 2.
- Figures 5 and 10 enlarged to the text width.
- Glossary becomes appendix D.

28 to 30 pages, no near-empty page.

Co-Authored-By: Claude Fable 5 <noreply@anthropic.com>
</commit_message>
<xml_diff>
--- a/deliverables/Dossier_de_projet_OpsForge_Dyllan_Thouvignon.docx
+++ b/deliverables/Dossier_de_projet_OpsForge_Dyllan_Thouvignon.docx
@@ -12,7 +12,7 @@
           <w:noProof/>
         </w:rPr>
         <w:drawing>
-          <wp:inline distT="0" distB="0" distL="0" distR="0" wp14:anchorId="0DB2393D" wp14:editId="094A82F9">
+          <wp:inline distT="0" distB="0" distL="0" distR="0" wp14:anchorId="68CC4CA9" wp14:editId="00A5E6D6">
             <wp:extent cx="756000" cy="756000"/>
             <wp:effectExtent l="0" t="0" r="0" b="0"/>
             <wp:docPr id="1" name="Picture 1"/>
@@ -481,7 +481,7 @@
       <w:r>
         <w:fldChar w:fldCharType="separate"/>
       </w:r>
-      <w:hyperlink w:anchor="_Toc238462264" w:history="1">
+      <w:hyperlink w:anchor="_Toc238463958" w:history="1">
         <w:r>
           <w:rPr>
             <w:rStyle w:val="Lienhypertexte"/>
@@ -508,7 +508,7 @@
             <w:noProof/>
             <w:webHidden/>
           </w:rPr>
-          <w:instrText xml:space="preserve"> PAGEREF _Toc238462264 \h </w:instrText>
+          <w:instrText xml:space="preserve"> PAGEREF _Toc238463958 \h </w:instrText>
         </w:r>
         <w:r>
           <w:rPr>
@@ -556,7 +556,7 @@
           <w14:ligatures w14:val="standardContextual"/>
         </w:rPr>
       </w:pPr>
-      <w:hyperlink w:anchor="_Toc238462265" w:history="1">
+      <w:hyperlink w:anchor="_Toc238463959" w:history="1">
         <w:r>
           <w:rPr>
             <w:rStyle w:val="Lienhypertexte"/>
@@ -583,7 +583,7 @@
             <w:noProof/>
             <w:webHidden/>
           </w:rPr>
-          <w:instrText xml:space="preserve"> PAGEREF _Toc238462265 \h </w:instrText>
+          <w:instrText xml:space="preserve"> PAGEREF _Toc238463959 \h </w:instrText>
         </w:r>
         <w:r>
           <w:rPr>
@@ -631,7 +631,7 @@
           <w14:ligatures w14:val="standardContextual"/>
         </w:rPr>
       </w:pPr>
-      <w:hyperlink w:anchor="_Toc238462266" w:history="1">
+      <w:hyperlink w:anchor="_Toc238463960" w:history="1">
         <w:r>
           <w:rPr>
             <w:rStyle w:val="Lienhypertexte"/>
@@ -658,7 +658,7 @@
             <w:noProof/>
             <w:webHidden/>
           </w:rPr>
-          <w:instrText xml:space="preserve"> PAGEREF _Toc238462266 \h </w:instrText>
+          <w:instrText xml:space="preserve"> PAGEREF _Toc238463960 \h </w:instrText>
         </w:r>
         <w:r>
           <w:rPr>
@@ -706,7 +706,7 @@
           <w14:ligatures w14:val="standardContextual"/>
         </w:rPr>
       </w:pPr>
-      <w:hyperlink w:anchor="_Toc238462267" w:history="1">
+      <w:hyperlink w:anchor="_Toc238463961" w:history="1">
         <w:r>
           <w:rPr>
             <w:rStyle w:val="Lienhypertexte"/>
@@ -733,7 +733,7 @@
             <w:noProof/>
             <w:webHidden/>
           </w:rPr>
-          <w:instrText xml:space="preserve"> PAGEREF _Toc238462267 \h </w:instrText>
+          <w:instrText xml:space="preserve"> PAGEREF _Toc238463961 \h </w:instrText>
         </w:r>
         <w:r>
           <w:rPr>
@@ -781,7 +781,7 @@
           <w14:ligatures w14:val="standardContextual"/>
         </w:rPr>
       </w:pPr>
-      <w:hyperlink w:anchor="_Toc238462268" w:history="1">
+      <w:hyperlink w:anchor="_Toc238463962" w:history="1">
         <w:r>
           <w:rPr>
             <w:rStyle w:val="Lienhypertexte"/>
@@ -808,7 +808,7 @@
             <w:noProof/>
             <w:webHidden/>
           </w:rPr>
-          <w:instrText xml:space="preserve"> PAGEREF _Toc238462268 \h </w:instrText>
+          <w:instrText xml:space="preserve"> PAGEREF _Toc238463962 \h </w:instrText>
         </w:r>
         <w:r>
           <w:rPr>
@@ -856,7 +856,7 @@
           <w14:ligatures w14:val="standardContextual"/>
         </w:rPr>
       </w:pPr>
-      <w:hyperlink w:anchor="_Toc238462269" w:history="1">
+      <w:hyperlink w:anchor="_Toc238463963" w:history="1">
         <w:r>
           <w:rPr>
             <w:rStyle w:val="Lienhypertexte"/>
@@ -883,7 +883,7 @@
             <w:noProof/>
             <w:webHidden/>
           </w:rPr>
-          <w:instrText xml:space="preserve"> PAGEREF _Toc238462269 \h </w:instrText>
+          <w:instrText xml:space="preserve"> PAGEREF _Toc238463963 \h </w:instrText>
         </w:r>
         <w:r>
           <w:rPr>
@@ -931,7 +931,7 @@
           <w14:ligatures w14:val="standardContextual"/>
         </w:rPr>
       </w:pPr>
-      <w:hyperlink w:anchor="_Toc238462270" w:history="1">
+      <w:hyperlink w:anchor="_Toc238463964" w:history="1">
         <w:r>
           <w:rPr>
             <w:rStyle w:val="Lienhypertexte"/>
@@ -958,7 +958,7 @@
             <w:noProof/>
             <w:webHidden/>
           </w:rPr>
-          <w:instrText xml:space="preserve"> PAGEREF _Toc238462270 \h </w:instrText>
+          <w:instrText xml:space="preserve"> PAGEREF _Toc238463964 \h </w:instrText>
         </w:r>
         <w:r>
           <w:rPr>
@@ -1006,7 +1006,7 @@
           <w14:ligatures w14:val="standardContextual"/>
         </w:rPr>
       </w:pPr>
-      <w:hyperlink w:anchor="_Toc238462271" w:history="1">
+      <w:hyperlink w:anchor="_Toc238463965" w:history="1">
         <w:r>
           <w:rPr>
             <w:rStyle w:val="Lienhypertexte"/>
@@ -1033,7 +1033,7 @@
             <w:noProof/>
             <w:webHidden/>
           </w:rPr>
-          <w:instrText xml:space="preserve"> PAGEREF _Toc238462271 \h </w:instrText>
+          <w:instrText xml:space="preserve"> PAGEREF _Toc238463965 \h </w:instrText>
         </w:r>
         <w:r>
           <w:rPr>
@@ -1081,7 +1081,7 @@
           <w14:ligatures w14:val="standardContextual"/>
         </w:rPr>
       </w:pPr>
-      <w:hyperlink w:anchor="_Toc238462272" w:history="1">
+      <w:hyperlink w:anchor="_Toc238463966" w:history="1">
         <w:r>
           <w:rPr>
             <w:rStyle w:val="Lienhypertexte"/>
@@ -1108,7 +1108,7 @@
             <w:noProof/>
             <w:webHidden/>
           </w:rPr>
-          <w:instrText xml:space="preserve"> PAGEREF _Toc238462272 \h </w:instrText>
+          <w:instrText xml:space="preserve"> PAGEREF _Toc238463966 \h </w:instrText>
         </w:r>
         <w:r>
           <w:rPr>
@@ -1156,7 +1156,7 @@
           <w14:ligatures w14:val="standardContextual"/>
         </w:rPr>
       </w:pPr>
-      <w:hyperlink w:anchor="_Toc238462273" w:history="1">
+      <w:hyperlink w:anchor="_Toc238463967" w:history="1">
         <w:r>
           <w:rPr>
             <w:rStyle w:val="Lienhypertexte"/>
@@ -1183,7 +1183,7 @@
             <w:noProof/>
             <w:webHidden/>
           </w:rPr>
-          <w:instrText xml:space="preserve"> PAGEREF _Toc238462273 \h </w:instrText>
+          <w:instrText xml:space="preserve"> PAGEREF _Toc238463967 \h </w:instrText>
         </w:r>
         <w:r>
           <w:rPr>
@@ -1231,7 +1231,7 @@
           <w14:ligatures w14:val="standardContextual"/>
         </w:rPr>
       </w:pPr>
-      <w:hyperlink w:anchor="_Toc238462274" w:history="1">
+      <w:hyperlink w:anchor="_Toc238463968" w:history="1">
         <w:r>
           <w:rPr>
             <w:rStyle w:val="Lienhypertexte"/>
@@ -1258,7 +1258,7 @@
             <w:noProof/>
             <w:webHidden/>
           </w:rPr>
-          <w:instrText xml:space="preserve"> PAGEREF _Toc238462274 \h </w:instrText>
+          <w:instrText xml:space="preserve"> PAGEREF _Toc238463968 \h </w:instrText>
         </w:r>
         <w:r>
           <w:rPr>
@@ -1306,7 +1306,7 @@
           <w14:ligatures w14:val="standardContextual"/>
         </w:rPr>
       </w:pPr>
-      <w:hyperlink w:anchor="_Toc238462275" w:history="1">
+      <w:hyperlink w:anchor="_Toc238463969" w:history="1">
         <w:r>
           <w:rPr>
             <w:rStyle w:val="Lienhypertexte"/>
@@ -1333,7 +1333,7 @@
             <w:noProof/>
             <w:webHidden/>
           </w:rPr>
-          <w:instrText xml:space="preserve"> PAGEREF _Toc238462275 \h </w:instrText>
+          <w:instrText xml:space="preserve"> PAGEREF _Toc238463969 \h </w:instrText>
         </w:r>
         <w:r>
           <w:rPr>
@@ -1381,7 +1381,7 @@
           <w14:ligatures w14:val="standardContextual"/>
         </w:rPr>
       </w:pPr>
-      <w:hyperlink w:anchor="_Toc238462276" w:history="1">
+      <w:hyperlink w:anchor="_Toc238463970" w:history="1">
         <w:r>
           <w:rPr>
             <w:rStyle w:val="Lienhypertexte"/>
@@ -1408,7 +1408,7 @@
             <w:noProof/>
             <w:webHidden/>
           </w:rPr>
-          <w:instrText xml:space="preserve"> PAGEREF _Toc238462276 \h </w:instrText>
+          <w:instrText xml:space="preserve"> PAGEREF _Toc238463970 \h </w:instrText>
         </w:r>
         <w:r>
           <w:rPr>
@@ -1456,7 +1456,7 @@
           <w14:ligatures w14:val="standardContextual"/>
         </w:rPr>
       </w:pPr>
-      <w:hyperlink w:anchor="_Toc238462277" w:history="1">
+      <w:hyperlink w:anchor="_Toc238463971" w:history="1">
         <w:r>
           <w:rPr>
             <w:rStyle w:val="Lienhypertexte"/>
@@ -1483,7 +1483,7 @@
             <w:noProof/>
             <w:webHidden/>
           </w:rPr>
-          <w:instrText xml:space="preserve"> PAGEREF _Toc238462277 \h </w:instrText>
+          <w:instrText xml:space="preserve"> PAGEREF _Toc238463971 \h </w:instrText>
         </w:r>
         <w:r>
           <w:rPr>
@@ -1531,7 +1531,7 @@
           <w14:ligatures w14:val="standardContextual"/>
         </w:rPr>
       </w:pPr>
-      <w:hyperlink w:anchor="_Toc238462278" w:history="1">
+      <w:hyperlink w:anchor="_Toc238463972" w:history="1">
         <w:r>
           <w:rPr>
             <w:rStyle w:val="Lienhypertexte"/>
@@ -1558,7 +1558,7 @@
             <w:noProof/>
             <w:webHidden/>
           </w:rPr>
-          <w:instrText xml:space="preserve"> PAGEREF _Toc238462278 \h </w:instrText>
+          <w:instrText xml:space="preserve"> PAGEREF _Toc238463972 \h </w:instrText>
         </w:r>
         <w:r>
           <w:rPr>
@@ -1606,7 +1606,7 @@
           <w14:ligatures w14:val="standardContextual"/>
         </w:rPr>
       </w:pPr>
-      <w:hyperlink w:anchor="_Toc238462279" w:history="1">
+      <w:hyperlink w:anchor="_Toc238463973" w:history="1">
         <w:r>
           <w:rPr>
             <w:rStyle w:val="Lienhypertexte"/>
@@ -1633,7 +1633,7 @@
             <w:noProof/>
             <w:webHidden/>
           </w:rPr>
-          <w:instrText xml:space="preserve"> PAGEREF _Toc238462279 \h </w:instrText>
+          <w:instrText xml:space="preserve"> PAGEREF _Toc238463973 \h </w:instrText>
         </w:r>
         <w:r>
           <w:rPr>
@@ -1681,7 +1681,7 @@
           <w14:ligatures w14:val="standardContextual"/>
         </w:rPr>
       </w:pPr>
-      <w:hyperlink w:anchor="_Toc238462280" w:history="1">
+      <w:hyperlink w:anchor="_Toc238463974" w:history="1">
         <w:r>
           <w:rPr>
             <w:rStyle w:val="Lienhypertexte"/>
@@ -1708,7 +1708,7 @@
             <w:noProof/>
             <w:webHidden/>
           </w:rPr>
-          <w:instrText xml:space="preserve"> PAGEREF _Toc238462280 \h </w:instrText>
+          <w:instrText xml:space="preserve"> PAGEREF _Toc238463974 \h </w:instrText>
         </w:r>
         <w:r>
           <w:rPr>
@@ -1756,7 +1756,7 @@
           <w14:ligatures w14:val="standardContextual"/>
         </w:rPr>
       </w:pPr>
-      <w:hyperlink w:anchor="_Toc238462281" w:history="1">
+      <w:hyperlink w:anchor="_Toc238463975" w:history="1">
         <w:r>
           <w:rPr>
             <w:rStyle w:val="Lienhypertexte"/>
@@ -1783,7 +1783,7 @@
             <w:noProof/>
             <w:webHidden/>
           </w:rPr>
-          <w:instrText xml:space="preserve"> PAGEREF _Toc238462281 \h </w:instrText>
+          <w:instrText xml:space="preserve"> PAGEREF _Toc238463975 \h </w:instrText>
         </w:r>
         <w:r>
           <w:rPr>
@@ -1831,7 +1831,7 @@
           <w14:ligatures w14:val="standardContextual"/>
         </w:rPr>
       </w:pPr>
-      <w:hyperlink w:anchor="_Toc238462282" w:history="1">
+      <w:hyperlink w:anchor="_Toc238463976" w:history="1">
         <w:r>
           <w:rPr>
             <w:rStyle w:val="Lienhypertexte"/>
@@ -1858,7 +1858,7 @@
             <w:noProof/>
             <w:webHidden/>
           </w:rPr>
-          <w:instrText xml:space="preserve"> PAGEREF _Toc238462282 \h </w:instrText>
+          <w:instrText xml:space="preserve"> PAGEREF _Toc238463976 \h </w:instrText>
         </w:r>
         <w:r>
           <w:rPr>
@@ -1906,7 +1906,7 @@
           <w14:ligatures w14:val="standardContextual"/>
         </w:rPr>
       </w:pPr>
-      <w:hyperlink w:anchor="_Toc238462283" w:history="1">
+      <w:hyperlink w:anchor="_Toc238463977" w:history="1">
         <w:r>
           <w:rPr>
             <w:rStyle w:val="Lienhypertexte"/>
@@ -1933,7 +1933,7 @@
             <w:noProof/>
             <w:webHidden/>
           </w:rPr>
-          <w:instrText xml:space="preserve"> PAGEREF _Toc238462283 \h </w:instrText>
+          <w:instrText xml:space="preserve"> PAGEREF _Toc238463977 \h </w:instrText>
         </w:r>
         <w:r>
           <w:rPr>
@@ -1981,7 +1981,7 @@
           <w14:ligatures w14:val="standardContextual"/>
         </w:rPr>
       </w:pPr>
-      <w:hyperlink w:anchor="_Toc238462284" w:history="1">
+      <w:hyperlink w:anchor="_Toc238463978" w:history="1">
         <w:r>
           <w:rPr>
             <w:rStyle w:val="Lienhypertexte"/>
@@ -2008,7 +2008,7 @@
             <w:noProof/>
             <w:webHidden/>
           </w:rPr>
-          <w:instrText xml:space="preserve"> PAGEREF _Toc238462284 \h </w:instrText>
+          <w:instrText xml:space="preserve"> PAGEREF _Toc238463978 \h </w:instrText>
         </w:r>
         <w:r>
           <w:rPr>
@@ -2056,7 +2056,7 @@
           <w14:ligatures w14:val="standardContextual"/>
         </w:rPr>
       </w:pPr>
-      <w:hyperlink w:anchor="_Toc238462285" w:history="1">
+      <w:hyperlink w:anchor="_Toc238463979" w:history="1">
         <w:r>
           <w:rPr>
             <w:rStyle w:val="Lienhypertexte"/>
@@ -2083,7 +2083,7 @@
             <w:noProof/>
             <w:webHidden/>
           </w:rPr>
-          <w:instrText xml:space="preserve"> PAGEREF _Toc238462285 \h </w:instrText>
+          <w:instrText xml:space="preserve"> PAGEREF _Toc238463979 \h </w:instrText>
         </w:r>
         <w:r>
           <w:rPr>
@@ -2131,7 +2131,7 @@
           <w14:ligatures w14:val="standardContextual"/>
         </w:rPr>
       </w:pPr>
-      <w:hyperlink w:anchor="_Toc238462286" w:history="1">
+      <w:hyperlink w:anchor="_Toc238463980" w:history="1">
         <w:r>
           <w:rPr>
             <w:rStyle w:val="Lienhypertexte"/>
@@ -2158,7 +2158,7 @@
             <w:noProof/>
             <w:webHidden/>
           </w:rPr>
-          <w:instrText xml:space="preserve"> PAGEREF _Toc238462286 \h </w:instrText>
+          <w:instrText xml:space="preserve"> PAGEREF _Toc238463980 \h </w:instrText>
         </w:r>
         <w:r>
           <w:rPr>
@@ -2206,7 +2206,7 @@
           <w14:ligatures w14:val="standardContextual"/>
         </w:rPr>
       </w:pPr>
-      <w:hyperlink w:anchor="_Toc238462287" w:history="1">
+      <w:hyperlink w:anchor="_Toc238463981" w:history="1">
         <w:r>
           <w:rPr>
             <w:rStyle w:val="Lienhypertexte"/>
@@ -2233,7 +2233,7 @@
             <w:noProof/>
             <w:webHidden/>
           </w:rPr>
-          <w:instrText xml:space="preserve"> PAGEREF _Toc238462287 \h </w:instrText>
+          <w:instrText xml:space="preserve"> PAGEREF _Toc238463981 \h </w:instrText>
         </w:r>
         <w:r>
           <w:rPr>
@@ -2281,7 +2281,7 @@
           <w14:ligatures w14:val="standardContextual"/>
         </w:rPr>
       </w:pPr>
-      <w:hyperlink w:anchor="_Toc238462288" w:history="1">
+      <w:hyperlink w:anchor="_Toc238463982" w:history="1">
         <w:r>
           <w:rPr>
             <w:rStyle w:val="Lienhypertexte"/>
@@ -2308,7 +2308,7 @@
             <w:noProof/>
             <w:webHidden/>
           </w:rPr>
-          <w:instrText xml:space="preserve"> PAGEREF _Toc238462288 \h </w:instrText>
+          <w:instrText xml:space="preserve"> PAGEREF _Toc238463982 \h </w:instrText>
         </w:r>
         <w:r>
           <w:rPr>
@@ -2356,7 +2356,7 @@
           <w14:ligatures w14:val="standardContextual"/>
         </w:rPr>
       </w:pPr>
-      <w:hyperlink w:anchor="_Toc238462289" w:history="1">
+      <w:hyperlink w:anchor="_Toc238463983" w:history="1">
         <w:r>
           <w:rPr>
             <w:rStyle w:val="Lienhypertexte"/>
@@ -2383,7 +2383,7 @@
             <w:noProof/>
             <w:webHidden/>
           </w:rPr>
-          <w:instrText xml:space="preserve"> PAGEREF _Toc238462289 \h </w:instrText>
+          <w:instrText xml:space="preserve"> PAGEREF _Toc238463983 \h </w:instrText>
         </w:r>
         <w:r>
           <w:rPr>
@@ -2431,7 +2431,7 @@
           <w14:ligatures w14:val="standardContextual"/>
         </w:rPr>
       </w:pPr>
-      <w:hyperlink w:anchor="_Toc238462290" w:history="1">
+      <w:hyperlink w:anchor="_Toc238463984" w:history="1">
         <w:r>
           <w:rPr>
             <w:rStyle w:val="Lienhypertexte"/>
@@ -2458,7 +2458,7 @@
             <w:noProof/>
             <w:webHidden/>
           </w:rPr>
-          <w:instrText xml:space="preserve"> PAGEREF _Toc238462290 \h </w:instrText>
+          <w:instrText xml:space="preserve"> PAGEREF _Toc238463984 \h </w:instrText>
         </w:r>
         <w:r>
           <w:rPr>
@@ -2506,7 +2506,7 @@
           <w14:ligatures w14:val="standardContextual"/>
         </w:rPr>
       </w:pPr>
-      <w:hyperlink w:anchor="_Toc238462291" w:history="1">
+      <w:hyperlink w:anchor="_Toc238463985" w:history="1">
         <w:r>
           <w:rPr>
             <w:rStyle w:val="Lienhypertexte"/>
@@ -2533,7 +2533,7 @@
             <w:noProof/>
             <w:webHidden/>
           </w:rPr>
-          <w:instrText xml:space="preserve"> PAGEREF _Toc238462291 \h </w:instrText>
+          <w:instrText xml:space="preserve"> PAGEREF _Toc238463985 \h </w:instrText>
         </w:r>
         <w:r>
           <w:rPr>
@@ -2581,7 +2581,7 @@
           <w14:ligatures w14:val="standardContextual"/>
         </w:rPr>
       </w:pPr>
-      <w:hyperlink w:anchor="_Toc238462292" w:history="1">
+      <w:hyperlink w:anchor="_Toc238463986" w:history="1">
         <w:r>
           <w:rPr>
             <w:rStyle w:val="Lienhypertexte"/>
@@ -2608,7 +2608,7 @@
             <w:noProof/>
             <w:webHidden/>
           </w:rPr>
-          <w:instrText xml:space="preserve"> PAGEREF _Toc238462292 \h </w:instrText>
+          <w:instrText xml:space="preserve"> PAGEREF _Toc238463986 \h </w:instrText>
         </w:r>
         <w:r>
           <w:rPr>
@@ -2656,7 +2656,7 @@
           <w14:ligatures w14:val="standardContextual"/>
         </w:rPr>
       </w:pPr>
-      <w:hyperlink w:anchor="_Toc238462293" w:history="1">
+      <w:hyperlink w:anchor="_Toc238463987" w:history="1">
         <w:r>
           <w:rPr>
             <w:rStyle w:val="Lienhypertexte"/>
@@ -2683,7 +2683,7 @@
             <w:noProof/>
             <w:webHidden/>
           </w:rPr>
-          <w:instrText xml:space="preserve"> PAGEREF _Toc238462293 \h </w:instrText>
+          <w:instrText xml:space="preserve"> PAGEREF _Toc238463987 \h </w:instrText>
         </w:r>
         <w:r>
           <w:rPr>
@@ -2731,7 +2731,7 @@
           <w14:ligatures w14:val="standardContextual"/>
         </w:rPr>
       </w:pPr>
-      <w:hyperlink w:anchor="_Toc238462294" w:history="1">
+      <w:hyperlink w:anchor="_Toc238463988" w:history="1">
         <w:r>
           <w:rPr>
             <w:rStyle w:val="Lienhypertexte"/>
@@ -2758,7 +2758,7 @@
             <w:noProof/>
             <w:webHidden/>
           </w:rPr>
-          <w:instrText xml:space="preserve"> PAGEREF _Toc238462294 \h </w:instrText>
+          <w:instrText xml:space="preserve"> PAGEREF _Toc238463988 \h </w:instrText>
         </w:r>
         <w:r>
           <w:rPr>
@@ -2806,7 +2806,7 @@
           <w14:ligatures w14:val="standardContextual"/>
         </w:rPr>
       </w:pPr>
-      <w:hyperlink w:anchor="_Toc238462295" w:history="1">
+      <w:hyperlink w:anchor="_Toc238463989" w:history="1">
         <w:r>
           <w:rPr>
             <w:rStyle w:val="Lienhypertexte"/>
@@ -2833,7 +2833,7 @@
             <w:noProof/>
             <w:webHidden/>
           </w:rPr>
-          <w:instrText xml:space="preserve"> PAGEREF _Toc238462295 \h </w:instrText>
+          <w:instrText xml:space="preserve"> PAGEREF _Toc238463989 \h </w:instrText>
         </w:r>
         <w:r>
           <w:rPr>
@@ -2881,7 +2881,7 @@
           <w14:ligatures w14:val="standardContextual"/>
         </w:rPr>
       </w:pPr>
-      <w:hyperlink w:anchor="_Toc238462296" w:history="1">
+      <w:hyperlink w:anchor="_Toc238463990" w:history="1">
         <w:r>
           <w:rPr>
             <w:rStyle w:val="Lienhypertexte"/>
@@ -2908,7 +2908,7 @@
             <w:noProof/>
             <w:webHidden/>
           </w:rPr>
-          <w:instrText xml:space="preserve"> PAGEREF _Toc238462296 \h </w:instrText>
+          <w:instrText xml:space="preserve"> PAGEREF _Toc238463990 \h </w:instrText>
         </w:r>
         <w:r>
           <w:rPr>
@@ -2956,7 +2956,7 @@
           <w14:ligatures w14:val="standardContextual"/>
         </w:rPr>
       </w:pPr>
-      <w:hyperlink w:anchor="_Toc238462297" w:history="1">
+      <w:hyperlink w:anchor="_Toc238463991" w:history="1">
         <w:r>
           <w:rPr>
             <w:rStyle w:val="Lienhypertexte"/>
@@ -2983,7 +2983,7 @@
             <w:noProof/>
             <w:webHidden/>
           </w:rPr>
-          <w:instrText xml:space="preserve"> PAGEREF _Toc238462297 \h </w:instrText>
+          <w:instrText xml:space="preserve"> PAGEREF _Toc238463991 \h </w:instrText>
         </w:r>
         <w:r>
           <w:rPr>
@@ -3031,7 +3031,7 @@
           <w14:ligatures w14:val="standardContextual"/>
         </w:rPr>
       </w:pPr>
-      <w:hyperlink w:anchor="_Toc238462298" w:history="1">
+      <w:hyperlink w:anchor="_Toc238463992" w:history="1">
         <w:r>
           <w:rPr>
             <w:rStyle w:val="Lienhypertexte"/>
@@ -3058,7 +3058,7 @@
             <w:noProof/>
             <w:webHidden/>
           </w:rPr>
-          <w:instrText xml:space="preserve"> PAGEREF _Toc238462298 \h </w:instrText>
+          <w:instrText xml:space="preserve"> PAGEREF _Toc238463992 \h </w:instrText>
         </w:r>
         <w:r>
           <w:rPr>
@@ -3106,7 +3106,7 @@
           <w14:ligatures w14:val="standardContextual"/>
         </w:rPr>
       </w:pPr>
-      <w:hyperlink w:anchor="_Toc238462299" w:history="1">
+      <w:hyperlink w:anchor="_Toc238463993" w:history="1">
         <w:r>
           <w:rPr>
             <w:rStyle w:val="Lienhypertexte"/>
@@ -3133,7 +3133,7 @@
             <w:noProof/>
             <w:webHidden/>
           </w:rPr>
-          <w:instrText xml:space="preserve"> PAGEREF _Toc238462299 \h </w:instrText>
+          <w:instrText xml:space="preserve"> PAGEREF _Toc238463993 \h </w:instrText>
         </w:r>
         <w:r>
           <w:rPr>
@@ -3181,7 +3181,7 @@
           <w14:ligatures w14:val="standardContextual"/>
         </w:rPr>
       </w:pPr>
-      <w:hyperlink w:anchor="_Toc238462300" w:history="1">
+      <w:hyperlink w:anchor="_Toc238463994" w:history="1">
         <w:r>
           <w:rPr>
             <w:rStyle w:val="Lienhypertexte"/>
@@ -3208,7 +3208,7 @@
             <w:noProof/>
             <w:webHidden/>
           </w:rPr>
-          <w:instrText xml:space="preserve"> PAGEREF _Toc238462300 \h </w:instrText>
+          <w:instrText xml:space="preserve"> PAGEREF _Toc238463994 \h </w:instrText>
         </w:r>
         <w:r>
           <w:rPr>
@@ -3256,7 +3256,7 @@
           <w14:ligatures w14:val="standardContextual"/>
         </w:rPr>
       </w:pPr>
-      <w:hyperlink w:anchor="_Toc238462301" w:history="1">
+      <w:hyperlink w:anchor="_Toc238463995" w:history="1">
         <w:r>
           <w:rPr>
             <w:rStyle w:val="Lienhypertexte"/>
@@ -3283,7 +3283,7 @@
             <w:noProof/>
             <w:webHidden/>
           </w:rPr>
-          <w:instrText xml:space="preserve"> PAGEREF _Toc238462301 \h </w:instrText>
+          <w:instrText xml:space="preserve"> PAGEREF _Toc238463995 \h </w:instrText>
         </w:r>
         <w:r>
           <w:rPr>
@@ -3331,7 +3331,7 @@
           <w14:ligatures w14:val="standardContextual"/>
         </w:rPr>
       </w:pPr>
-      <w:hyperlink w:anchor="_Toc238462302" w:history="1">
+      <w:hyperlink w:anchor="_Toc238463996" w:history="1">
         <w:r>
           <w:rPr>
             <w:rStyle w:val="Lienhypertexte"/>
@@ -3358,7 +3358,7 @@
             <w:noProof/>
             <w:webHidden/>
           </w:rPr>
-          <w:instrText xml:space="preserve"> PAGEREF _Toc238462302 \h </w:instrText>
+          <w:instrText xml:space="preserve"> PAGEREF _Toc238463996 \h </w:instrText>
         </w:r>
         <w:r>
           <w:rPr>
@@ -3378,7 +3378,7 @@
             <w:noProof/>
             <w:webHidden/>
           </w:rPr>
-          <w:t>22</w:t>
+          <w:t>23</w:t>
         </w:r>
         <w:r>
           <w:rPr>
@@ -3406,7 +3406,7 @@
           <w14:ligatures w14:val="standardContextual"/>
         </w:rPr>
       </w:pPr>
-      <w:hyperlink w:anchor="_Toc238462303" w:history="1">
+      <w:hyperlink w:anchor="_Toc238463997" w:history="1">
         <w:r>
           <w:rPr>
             <w:rStyle w:val="Lienhypertexte"/>
@@ -3433,7 +3433,7 @@
             <w:noProof/>
             <w:webHidden/>
           </w:rPr>
-          <w:instrText xml:space="preserve"> PAGEREF _Toc238462303 \h </w:instrText>
+          <w:instrText xml:space="preserve"> PAGEREF _Toc238463997 \h </w:instrText>
         </w:r>
         <w:r>
           <w:rPr>
@@ -3453,7 +3453,7 @@
             <w:noProof/>
             <w:webHidden/>
           </w:rPr>
-          <w:t>23</w:t>
+          <w:t>24</w:t>
         </w:r>
         <w:r>
           <w:rPr>
@@ -3481,7 +3481,7 @@
           <w14:ligatures w14:val="standardContextual"/>
         </w:rPr>
       </w:pPr>
-      <w:hyperlink w:anchor="_Toc238462304" w:history="1">
+      <w:hyperlink w:anchor="_Toc238463998" w:history="1">
         <w:r>
           <w:rPr>
             <w:rStyle w:val="Lienhypertexte"/>
@@ -3508,7 +3508,7 @@
             <w:noProof/>
             <w:webHidden/>
           </w:rPr>
-          <w:instrText xml:space="preserve"> PAGEREF _Toc238462304 \h </w:instrText>
+          <w:instrText xml:space="preserve"> PAGEREF _Toc238463998 \h </w:instrText>
         </w:r>
         <w:r>
           <w:rPr>
@@ -3528,7 +3528,7 @@
             <w:noProof/>
             <w:webHidden/>
           </w:rPr>
-          <w:t>24</w:t>
+          <w:t>25</w:t>
         </w:r>
         <w:r>
           <w:rPr>
@@ -3556,7 +3556,7 @@
           <w14:ligatures w14:val="standardContextual"/>
         </w:rPr>
       </w:pPr>
-      <w:hyperlink w:anchor="_Toc238462305" w:history="1">
+      <w:hyperlink w:anchor="_Toc238463999" w:history="1">
         <w:r>
           <w:rPr>
             <w:rStyle w:val="Lienhypertexte"/>
@@ -3583,7 +3583,7 @@
             <w:noProof/>
             <w:webHidden/>
           </w:rPr>
-          <w:instrText xml:space="preserve"> PAGEREF _Toc238462305 \h </w:instrText>
+          <w:instrText xml:space="preserve"> PAGEREF _Toc238463999 \h </w:instrText>
         </w:r>
         <w:r>
           <w:rPr>
@@ -3603,7 +3603,7 @@
             <w:noProof/>
             <w:webHidden/>
           </w:rPr>
-          <w:t>25</w:t>
+          <w:t>26</w:t>
         </w:r>
         <w:r>
           <w:rPr>
@@ -3631,7 +3631,7 @@
           <w14:ligatures w14:val="standardContextual"/>
         </w:rPr>
       </w:pPr>
-      <w:hyperlink w:anchor="_Toc238462306" w:history="1">
+      <w:hyperlink w:anchor="_Toc238464000" w:history="1">
         <w:r>
           <w:rPr>
             <w:rStyle w:val="Lienhypertexte"/>
@@ -3658,7 +3658,7 @@
             <w:noProof/>
             <w:webHidden/>
           </w:rPr>
-          <w:instrText xml:space="preserve"> PAGEREF _Toc238462306 \h </w:instrText>
+          <w:instrText xml:space="preserve"> PAGEREF _Toc238464000 \h </w:instrText>
         </w:r>
         <w:r>
           <w:rPr>
@@ -3678,7 +3678,7 @@
             <w:noProof/>
             <w:webHidden/>
           </w:rPr>
-          <w:t>26</w:t>
+          <w:t>27</w:t>
         </w:r>
         <w:r>
           <w:rPr>
@@ -3706,7 +3706,7 @@
           <w14:ligatures w14:val="standardContextual"/>
         </w:rPr>
       </w:pPr>
-      <w:hyperlink w:anchor="_Toc238462307" w:history="1">
+      <w:hyperlink w:anchor="_Toc238464001" w:history="1">
         <w:r>
           <w:rPr>
             <w:rStyle w:val="Lienhypertexte"/>
@@ -3733,7 +3733,7 @@
             <w:noProof/>
             <w:webHidden/>
           </w:rPr>
-          <w:instrText xml:space="preserve"> PAGEREF _Toc238462307 \h </w:instrText>
+          <w:instrText xml:space="preserve"> PAGEREF _Toc238464001 \h </w:instrText>
         </w:r>
         <w:r>
           <w:rPr>
@@ -3753,7 +3753,7 @@
             <w:noProof/>
             <w:webHidden/>
           </w:rPr>
-          <w:t>26</w:t>
+          <w:t>27</w:t>
         </w:r>
         <w:r>
           <w:rPr>
@@ -3781,7 +3781,7 @@
           <w14:ligatures w14:val="standardContextual"/>
         </w:rPr>
       </w:pPr>
-      <w:hyperlink w:anchor="_Toc238462308" w:history="1">
+      <w:hyperlink w:anchor="_Toc238464002" w:history="1">
         <w:r>
           <w:rPr>
             <w:rStyle w:val="Lienhypertexte"/>
@@ -3808,7 +3808,7 @@
             <w:noProof/>
             <w:webHidden/>
           </w:rPr>
-          <w:instrText xml:space="preserve"> PAGEREF _Toc238462308 \h </w:instrText>
+          <w:instrText xml:space="preserve"> PAGEREF _Toc238464002 \h </w:instrText>
         </w:r>
         <w:r>
           <w:rPr>
@@ -3828,7 +3828,7 @@
             <w:noProof/>
             <w:webHidden/>
           </w:rPr>
-          <w:t>26</w:t>
+          <w:t>27</w:t>
         </w:r>
         <w:r>
           <w:rPr>
@@ -3856,13 +3856,13 @@
           <w14:ligatures w14:val="standardContextual"/>
         </w:rPr>
       </w:pPr>
-      <w:hyperlink w:anchor="_Toc238462309" w:history="1">
+      <w:hyperlink w:anchor="_Toc238464003" w:history="1">
         <w:r>
           <w:rPr>
             <w:rStyle w:val="Lienhypertexte"/>
             <w:noProof/>
           </w:rPr>
-          <w:t>Annexe C — Glossaire</w:t>
+          <w:t>Annexe C — Reproduire les preuves</w:t>
         </w:r>
         <w:r>
           <w:rPr>
@@ -3883,7 +3883,7 @@
             <w:noProof/>
             <w:webHidden/>
           </w:rPr>
-          <w:instrText xml:space="preserve"> PAGEREF _Toc238462309 \h </w:instrText>
+          <w:instrText xml:space="preserve"> PAGEREF _Toc238464003 \h </w:instrText>
         </w:r>
         <w:r>
           <w:rPr>
@@ -3903,7 +3903,457 @@
             <w:noProof/>
             <w:webHidden/>
           </w:rPr>
-          <w:t>27</w:t>
+          <w:t>28</w:t>
+        </w:r>
+        <w:r>
+          <w:rPr>
+            <w:noProof/>
+            <w:webHidden/>
+          </w:rPr>
+          <w:fldChar w:fldCharType="end"/>
+        </w:r>
+      </w:hyperlink>
+    </w:p>
+    <w:p>
+      <w:pPr>
+        <w:pStyle w:val="TM2"/>
+        <w:tabs>
+          <w:tab w:val="right" w:leader="dot" w:pos="9402"/>
+        </w:tabs>
+        <w:rPr>
+          <w:rFonts w:asciiTheme="minorHAnsi" w:eastAsiaTheme="minorEastAsia" w:hAnsiTheme="minorHAnsi" w:cstheme="minorBidi"/>
+          <w:noProof/>
+          <w:color w:val="auto"/>
+          <w:kern w:val="2"/>
+          <w:sz w:val="24"/>
+          <w:szCs w:val="24"/>
+          <w:lang w:eastAsia="fr-FR"/>
+          <w14:ligatures w14:val="standardContextual"/>
+        </w:rPr>
+      </w:pPr>
+      <w:hyperlink w:anchor="_Toc238464004" w:history="1">
+        <w:r>
+          <w:rPr>
+            <w:rStyle w:val="Lienhypertexte"/>
+            <w:noProof/>
+          </w:rPr>
+          <w:t>C.1 Application et tests</w:t>
+        </w:r>
+        <w:r>
+          <w:rPr>
+            <w:noProof/>
+            <w:webHidden/>
+          </w:rPr>
+          <w:tab/>
+        </w:r>
+        <w:r>
+          <w:rPr>
+            <w:noProof/>
+            <w:webHidden/>
+          </w:rPr>
+          <w:fldChar w:fldCharType="begin"/>
+        </w:r>
+        <w:r>
+          <w:rPr>
+            <w:noProof/>
+            <w:webHidden/>
+          </w:rPr>
+          <w:instrText xml:space="preserve"> PAGEREF _Toc238464004 \h </w:instrText>
+        </w:r>
+        <w:r>
+          <w:rPr>
+            <w:noProof/>
+            <w:webHidden/>
+          </w:rPr>
+        </w:r>
+        <w:r>
+          <w:rPr>
+            <w:noProof/>
+            <w:webHidden/>
+          </w:rPr>
+          <w:fldChar w:fldCharType="separate"/>
+        </w:r>
+        <w:r>
+          <w:rPr>
+            <w:noProof/>
+            <w:webHidden/>
+          </w:rPr>
+          <w:t>28</w:t>
+        </w:r>
+        <w:r>
+          <w:rPr>
+            <w:noProof/>
+            <w:webHidden/>
+          </w:rPr>
+          <w:fldChar w:fldCharType="end"/>
+        </w:r>
+      </w:hyperlink>
+    </w:p>
+    <w:p>
+      <w:pPr>
+        <w:pStyle w:val="TM2"/>
+        <w:tabs>
+          <w:tab w:val="right" w:leader="dot" w:pos="9402"/>
+        </w:tabs>
+        <w:rPr>
+          <w:rFonts w:asciiTheme="minorHAnsi" w:eastAsiaTheme="minorEastAsia" w:hAnsiTheme="minorHAnsi" w:cstheme="minorBidi"/>
+          <w:noProof/>
+          <w:color w:val="auto"/>
+          <w:kern w:val="2"/>
+          <w:sz w:val="24"/>
+          <w:szCs w:val="24"/>
+          <w:lang w:eastAsia="fr-FR"/>
+          <w14:ligatures w14:val="standardContextual"/>
+        </w:rPr>
+      </w:pPr>
+      <w:hyperlink w:anchor="_Toc238464005" w:history="1">
+        <w:r>
+          <w:rPr>
+            <w:rStyle w:val="Lienhypertexte"/>
+            <w:noProof/>
+          </w:rPr>
+          <w:t>C.2 Déploiement de l’infrastructure par Ansible (CP n° 2)</w:t>
+        </w:r>
+        <w:r>
+          <w:rPr>
+            <w:noProof/>
+            <w:webHidden/>
+          </w:rPr>
+          <w:tab/>
+        </w:r>
+        <w:r>
+          <w:rPr>
+            <w:noProof/>
+            <w:webHidden/>
+          </w:rPr>
+          <w:fldChar w:fldCharType="begin"/>
+        </w:r>
+        <w:r>
+          <w:rPr>
+            <w:noProof/>
+            <w:webHidden/>
+          </w:rPr>
+          <w:instrText xml:space="preserve"> PAGEREF _Toc238464005 \h </w:instrText>
+        </w:r>
+        <w:r>
+          <w:rPr>
+            <w:noProof/>
+            <w:webHidden/>
+          </w:rPr>
+        </w:r>
+        <w:r>
+          <w:rPr>
+            <w:noProof/>
+            <w:webHidden/>
+          </w:rPr>
+          <w:fldChar w:fldCharType="separate"/>
+        </w:r>
+        <w:r>
+          <w:rPr>
+            <w:noProof/>
+            <w:webHidden/>
+          </w:rPr>
+          <w:t>28</w:t>
+        </w:r>
+        <w:r>
+          <w:rPr>
+            <w:noProof/>
+            <w:webHidden/>
+          </w:rPr>
+          <w:fldChar w:fldCharType="end"/>
+        </w:r>
+      </w:hyperlink>
+    </w:p>
+    <w:p>
+      <w:pPr>
+        <w:pStyle w:val="TM2"/>
+        <w:tabs>
+          <w:tab w:val="right" w:leader="dot" w:pos="9402"/>
+        </w:tabs>
+        <w:rPr>
+          <w:rFonts w:asciiTheme="minorHAnsi" w:eastAsiaTheme="minorEastAsia" w:hAnsiTheme="minorHAnsi" w:cstheme="minorBidi"/>
+          <w:noProof/>
+          <w:color w:val="auto"/>
+          <w:kern w:val="2"/>
+          <w:sz w:val="24"/>
+          <w:szCs w:val="24"/>
+          <w:lang w:eastAsia="fr-FR"/>
+          <w14:ligatures w14:val="standardContextual"/>
+        </w:rPr>
+      </w:pPr>
+      <w:hyperlink w:anchor="_Toc238464006" w:history="1">
+        <w:r>
+          <w:rPr>
+            <w:rStyle w:val="Lienhypertexte"/>
+            <w:noProof/>
+          </w:rPr>
+          <w:t>C.3 Persistance du stockage (CP n° 7)</w:t>
+        </w:r>
+        <w:r>
+          <w:rPr>
+            <w:noProof/>
+            <w:webHidden/>
+          </w:rPr>
+          <w:tab/>
+        </w:r>
+        <w:r>
+          <w:rPr>
+            <w:noProof/>
+            <w:webHidden/>
+          </w:rPr>
+          <w:fldChar w:fldCharType="begin"/>
+        </w:r>
+        <w:r>
+          <w:rPr>
+            <w:noProof/>
+            <w:webHidden/>
+          </w:rPr>
+          <w:instrText xml:space="preserve"> PAGEREF _Toc238464006 \h </w:instrText>
+        </w:r>
+        <w:r>
+          <w:rPr>
+            <w:noProof/>
+            <w:webHidden/>
+          </w:rPr>
+        </w:r>
+        <w:r>
+          <w:rPr>
+            <w:noProof/>
+            <w:webHidden/>
+          </w:rPr>
+          <w:fldChar w:fldCharType="separate"/>
+        </w:r>
+        <w:r>
+          <w:rPr>
+            <w:noProof/>
+            <w:webHidden/>
+          </w:rPr>
+          <w:t>28</w:t>
+        </w:r>
+        <w:r>
+          <w:rPr>
+            <w:noProof/>
+            <w:webHidden/>
+          </w:rPr>
+          <w:fldChar w:fldCharType="end"/>
+        </w:r>
+      </w:hyperlink>
+    </w:p>
+    <w:p>
+      <w:pPr>
+        <w:pStyle w:val="TM2"/>
+        <w:tabs>
+          <w:tab w:val="right" w:leader="dot" w:pos="9402"/>
+        </w:tabs>
+        <w:rPr>
+          <w:rFonts w:asciiTheme="minorHAnsi" w:eastAsiaTheme="minorEastAsia" w:hAnsiTheme="minorHAnsi" w:cstheme="minorBidi"/>
+          <w:noProof/>
+          <w:color w:val="auto"/>
+          <w:kern w:val="2"/>
+          <w:sz w:val="24"/>
+          <w:szCs w:val="24"/>
+          <w:lang w:eastAsia="fr-FR"/>
+          <w14:ligatures w14:val="standardContextual"/>
+        </w:rPr>
+      </w:pPr>
+      <w:hyperlink w:anchor="_Toc238464007" w:history="1">
+        <w:r>
+          <w:rPr>
+            <w:rStyle w:val="Lienhypertexte"/>
+            <w:noProof/>
+          </w:rPr>
+          <w:t>C.4 Supervision et déclenchement réel de l’alerte (CP n° 10)</w:t>
+        </w:r>
+        <w:r>
+          <w:rPr>
+            <w:noProof/>
+            <w:webHidden/>
+          </w:rPr>
+          <w:tab/>
+        </w:r>
+        <w:r>
+          <w:rPr>
+            <w:noProof/>
+            <w:webHidden/>
+          </w:rPr>
+          <w:fldChar w:fldCharType="begin"/>
+        </w:r>
+        <w:r>
+          <w:rPr>
+            <w:noProof/>
+            <w:webHidden/>
+          </w:rPr>
+          <w:instrText xml:space="preserve"> PAGEREF _Toc238464007 \h </w:instrText>
+        </w:r>
+        <w:r>
+          <w:rPr>
+            <w:noProof/>
+            <w:webHidden/>
+          </w:rPr>
+        </w:r>
+        <w:r>
+          <w:rPr>
+            <w:noProof/>
+            <w:webHidden/>
+          </w:rPr>
+          <w:fldChar w:fldCharType="separate"/>
+        </w:r>
+        <w:r>
+          <w:rPr>
+            <w:noProof/>
+            <w:webHidden/>
+          </w:rPr>
+          <w:t>28</w:t>
+        </w:r>
+        <w:r>
+          <w:rPr>
+            <w:noProof/>
+            <w:webHidden/>
+          </w:rPr>
+          <w:fldChar w:fldCharType="end"/>
+        </w:r>
+      </w:hyperlink>
+    </w:p>
+    <w:p>
+      <w:pPr>
+        <w:pStyle w:val="TM2"/>
+        <w:tabs>
+          <w:tab w:val="right" w:leader="dot" w:pos="9402"/>
+        </w:tabs>
+        <w:rPr>
+          <w:rFonts w:asciiTheme="minorHAnsi" w:eastAsiaTheme="minorEastAsia" w:hAnsiTheme="minorHAnsi" w:cstheme="minorBidi"/>
+          <w:noProof/>
+          <w:color w:val="auto"/>
+          <w:kern w:val="2"/>
+          <w:sz w:val="24"/>
+          <w:szCs w:val="24"/>
+          <w:lang w:eastAsia="fr-FR"/>
+          <w14:ligatures w14:val="standardContextual"/>
+        </w:rPr>
+      </w:pPr>
+      <w:hyperlink w:anchor="_Toc238464008" w:history="1">
+        <w:r>
+          <w:rPr>
+            <w:rStyle w:val="Lienhypertexte"/>
+            <w:noProof/>
+          </w:rPr>
+          <w:t>C.5 Sauvegarde et restauration</w:t>
+        </w:r>
+        <w:r>
+          <w:rPr>
+            <w:noProof/>
+            <w:webHidden/>
+          </w:rPr>
+          <w:tab/>
+        </w:r>
+        <w:r>
+          <w:rPr>
+            <w:noProof/>
+            <w:webHidden/>
+          </w:rPr>
+          <w:fldChar w:fldCharType="begin"/>
+        </w:r>
+        <w:r>
+          <w:rPr>
+            <w:noProof/>
+            <w:webHidden/>
+          </w:rPr>
+          <w:instrText xml:space="preserve"> PAGEREF _Toc238464008 \h </w:instrText>
+        </w:r>
+        <w:r>
+          <w:rPr>
+            <w:noProof/>
+            <w:webHidden/>
+          </w:rPr>
+        </w:r>
+        <w:r>
+          <w:rPr>
+            <w:noProof/>
+            <w:webHidden/>
+          </w:rPr>
+          <w:fldChar w:fldCharType="separate"/>
+        </w:r>
+        <w:r>
+          <w:rPr>
+            <w:noProof/>
+            <w:webHidden/>
+          </w:rPr>
+          <w:t>28</w:t>
+        </w:r>
+        <w:r>
+          <w:rPr>
+            <w:noProof/>
+            <w:webHidden/>
+          </w:rPr>
+          <w:fldChar w:fldCharType="end"/>
+        </w:r>
+      </w:hyperlink>
+    </w:p>
+    <w:p>
+      <w:pPr>
+        <w:pStyle w:val="TM1"/>
+        <w:tabs>
+          <w:tab w:val="right" w:leader="dot" w:pos="9402"/>
+        </w:tabs>
+        <w:rPr>
+          <w:rFonts w:asciiTheme="minorHAnsi" w:eastAsiaTheme="minorEastAsia" w:hAnsiTheme="minorHAnsi" w:cstheme="minorBidi"/>
+          <w:noProof/>
+          <w:color w:val="auto"/>
+          <w:kern w:val="2"/>
+          <w:sz w:val="24"/>
+          <w:szCs w:val="24"/>
+          <w:lang w:eastAsia="fr-FR"/>
+          <w14:ligatures w14:val="standardContextual"/>
+        </w:rPr>
+      </w:pPr>
+      <w:hyperlink w:anchor="_Toc238464009" w:history="1">
+        <w:r>
+          <w:rPr>
+            <w:rStyle w:val="Lienhypertexte"/>
+            <w:noProof/>
+          </w:rPr>
+          <w:t>Annexe D — Glossaire</w:t>
+        </w:r>
+        <w:r>
+          <w:rPr>
+            <w:noProof/>
+            <w:webHidden/>
+          </w:rPr>
+          <w:tab/>
+        </w:r>
+        <w:r>
+          <w:rPr>
+            <w:noProof/>
+            <w:webHidden/>
+          </w:rPr>
+          <w:fldChar w:fldCharType="begin"/>
+        </w:r>
+        <w:r>
+          <w:rPr>
+            <w:noProof/>
+            <w:webHidden/>
+          </w:rPr>
+          <w:instrText xml:space="preserve"> PAGEREF _Toc238464009 \h </w:instrText>
+        </w:r>
+        <w:r>
+          <w:rPr>
+            <w:noProof/>
+            <w:webHidden/>
+          </w:rPr>
+        </w:r>
+        <w:r>
+          <w:rPr>
+            <w:noProof/>
+            <w:webHidden/>
+          </w:rPr>
+          <w:fldChar w:fldCharType="separate"/>
+        </w:r>
+        <w:r>
+          <w:rPr>
+            <w:noProof/>
+            <w:webHidden/>
+          </w:rPr>
+          <w:t>29</w:t>
         </w:r>
         <w:r>
           <w:rPr>
@@ -3930,7 +4380,7 @@
           <w:bottom w:val="single" w:sz="8" w:space="6" w:color="99C7C0"/>
         </w:pBdr>
       </w:pPr>
-      <w:bookmarkStart w:id="0" w:name="_Toc238462264"/>
+      <w:bookmarkStart w:id="0" w:name="_Toc238463958"/>
       <w:r>
         <w:lastRenderedPageBreak/>
         <w:t>Le projet en 60 secondes</w:t>
@@ -4296,7 +4746,7 @@
           <w:bottom w:val="single" w:sz="8" w:space="6" w:color="99C7C0"/>
         </w:pBdr>
       </w:pPr>
-      <w:bookmarkStart w:id="1" w:name="_Toc238462265"/>
+      <w:bookmarkStart w:id="1" w:name="_Toc238463959"/>
       <w:r>
         <w:t>Introduction</w:t>
       </w:r>
@@ -4343,7 +4793,7 @@
           <w:bottom w:val="single" w:sz="8" w:space="6" w:color="99C7C0"/>
         </w:pBdr>
       </w:pPr>
-      <w:bookmarkStart w:id="2" w:name="_Toc238462266"/>
+      <w:bookmarkStart w:id="2" w:name="_Toc238463960"/>
       <w:r>
         <w:lastRenderedPageBreak/>
         <w:t>1. Compétences du référentiel couvertes par le projet</w:t>
@@ -4354,7 +4804,7 @@
       <w:pPr>
         <w:pStyle w:val="Titre2"/>
       </w:pPr>
-      <w:bookmarkStart w:id="3" w:name="_Toc238462267"/>
+      <w:bookmarkStart w:id="3" w:name="_Toc238463961"/>
       <w:r>
         <w:t>1.1 Les trois compétences obligatoires, critère par critère</w:t>
       </w:r>
@@ -5427,7 +5877,7 @@
       <w:pPr>
         <w:pStyle w:val="Titre2"/>
       </w:pPr>
-      <w:bookmarkStart w:id="4" w:name="_Toc238462268"/>
+      <w:bookmarkStart w:id="4" w:name="_Toc238463962"/>
       <w:r>
         <w:t>1.2 Compétences partiellement mises en pratique</w:t>
       </w:r>
@@ -5835,7 +6285,7 @@
           <w:bottom w:val="single" w:sz="8" w:space="6" w:color="99C7C0"/>
         </w:pBdr>
       </w:pPr>
-      <w:bookmarkStart w:id="5" w:name="_Toc238462269"/>
+      <w:bookmarkStart w:id="5" w:name="_Toc238463963"/>
       <w:r>
         <w:lastRenderedPageBreak/>
         <w:t>2. Cahier des charges</w:t>
@@ -5846,7 +6296,7 @@
       <w:pPr>
         <w:pStyle w:val="Titre2"/>
       </w:pPr>
-      <w:bookmarkStart w:id="6" w:name="_Toc238462270"/>
+      <w:bookmarkStart w:id="6" w:name="_Toc238463964"/>
       <w:r>
         <w:t>2.1 Contexte</w:t>
       </w:r>
@@ -5861,7 +6311,7 @@
       <w:pPr>
         <w:pStyle w:val="Titre2"/>
       </w:pPr>
-      <w:bookmarkStart w:id="7" w:name="_Toc238462271"/>
+      <w:bookmarkStart w:id="7" w:name="_Toc238463965"/>
       <w:r>
         <w:t>2.2 Problématique et objectifs</w:t>
       </w:r>
@@ -5963,7 +6413,7 @@
       <w:pPr>
         <w:pStyle w:val="Titre2"/>
       </w:pPr>
-      <w:bookmarkStart w:id="8" w:name="_Toc238462272"/>
+      <w:bookmarkStart w:id="8" w:name="_Toc238463966"/>
       <w:r>
         <w:t>2.3 Utilisateur et cas d’usage</w:t>
       </w:r>
@@ -6151,7 +6601,7 @@
         </w:rPr>
         <w:lastRenderedPageBreak/>
         <w:drawing>
-          <wp:inline distT="0" distB="0" distL="0" distR="0" wp14:anchorId="0A8F4B93" wp14:editId="3652F3F6">
+          <wp:inline distT="0" distB="0" distL="0" distR="0" wp14:anchorId="77954162" wp14:editId="33FA3BCC">
             <wp:extent cx="5976000" cy="4482000"/>
             <wp:effectExtent l="0" t="0" r="0" b="0"/>
             <wp:docPr id="2" name="Picture 2"/>
@@ -6213,7 +6663,7 @@
           <w:noProof/>
         </w:rPr>
         <w:drawing>
-          <wp:inline distT="0" distB="0" distL="0" distR="0" wp14:anchorId="2765E8A1" wp14:editId="0B9A2E2D">
+          <wp:inline distT="0" distB="0" distL="0" distR="0" wp14:anchorId="21D4D568" wp14:editId="7D0BB784">
             <wp:extent cx="5976000" cy="2822000"/>
             <wp:effectExtent l="0" t="0" r="0" b="0"/>
             <wp:docPr id="3" name="Picture 3"/>
@@ -6300,7 +6750,7 @@
       <w:pPr>
         <w:pStyle w:val="Titre2"/>
       </w:pPr>
-      <w:bookmarkStart w:id="9" w:name="_Toc238462273"/>
+      <w:bookmarkStart w:id="9" w:name="_Toc238463967"/>
       <w:r>
         <w:t>2.4 Besoins</w:t>
       </w:r>
@@ -6384,7 +6834,7 @@
       <w:pPr>
         <w:pStyle w:val="Titre2"/>
       </w:pPr>
-      <w:bookmarkStart w:id="10" w:name="_Toc238462274"/>
+      <w:bookmarkStart w:id="10" w:name="_Toc238463968"/>
       <w:r>
         <w:t>2.5 Contraintes</w:t>
       </w:r>
@@ -6494,7 +6944,7 @@
       <w:pPr>
         <w:pStyle w:val="Titre2"/>
       </w:pPr>
-      <w:bookmarkStart w:id="11" w:name="_Toc238462275"/>
+      <w:bookmarkStart w:id="11" w:name="_Toc238463969"/>
       <w:r>
         <w:t>2.6 Livrables et critères d’acceptation</w:t>
       </w:r>
@@ -6604,7 +7054,7 @@
       <w:pPr>
         <w:pStyle w:val="Titre2"/>
       </w:pPr>
-      <w:bookmarkStart w:id="12" w:name="_Toc238462276"/>
+      <w:bookmarkStart w:id="12" w:name="_Toc238463970"/>
       <w:r>
         <w:t>2.7 Hors périmètre et évolution du périmètre</w:t>
       </w:r>
@@ -6713,7 +7163,7 @@
           <w:bottom w:val="single" w:sz="8" w:space="6" w:color="99C7C0"/>
         </w:pBdr>
       </w:pPr>
-      <w:bookmarkStart w:id="13" w:name="_Toc238462277"/>
+      <w:bookmarkStart w:id="13" w:name="_Toc238463971"/>
       <w:r>
         <w:lastRenderedPageBreak/>
         <w:t>3. Spécifications techniques</w:t>
@@ -6724,7 +7174,7 @@
       <w:pPr>
         <w:pStyle w:val="Titre2"/>
       </w:pPr>
-      <w:bookmarkStart w:id="14" w:name="_Toc238462278"/>
+      <w:bookmarkStart w:id="14" w:name="_Toc238463972"/>
       <w:r>
         <w:t>3.1 Architecture logique</w:t>
       </w:r>
@@ -6742,7 +7192,7 @@
           <w:noProof/>
         </w:rPr>
         <w:drawing>
-          <wp:inline distT="0" distB="0" distL="0" distR="0" wp14:anchorId="34EA24FA" wp14:editId="1599603E">
+          <wp:inline distT="0" distB="0" distL="0" distR="0" wp14:anchorId="458C40C2" wp14:editId="309D2B6B">
             <wp:extent cx="5976000" cy="3626814"/>
             <wp:effectExtent l="0" t="0" r="0" b="0"/>
             <wp:docPr id="4" name="Picture 4"/>
@@ -6810,7 +7260,7 @@
       <w:pPr>
         <w:pStyle w:val="Titre2"/>
       </w:pPr>
-      <w:bookmarkStart w:id="15" w:name="_Toc238462279"/>
+      <w:bookmarkStart w:id="15" w:name="_Toc238463973"/>
       <w:r>
         <w:lastRenderedPageBreak/>
         <w:t>3.2 Topologie de déploiement</w:t>
@@ -6829,7 +7279,7 @@
           <w:noProof/>
         </w:rPr>
         <w:drawing>
-          <wp:inline distT="0" distB="0" distL="0" distR="0" wp14:anchorId="380DE0B3" wp14:editId="0771F305">
+          <wp:inline distT="0" distB="0" distL="0" distR="0" wp14:anchorId="189772A7" wp14:editId="05162ECA">
             <wp:extent cx="5976000" cy="3781827"/>
             <wp:effectExtent l="0" t="0" r="0" b="0"/>
             <wp:docPr id="5" name="Picture 5"/>
@@ -6912,7 +7362,7 @@
       <w:pPr>
         <w:pStyle w:val="Titre2"/>
       </w:pPr>
-      <w:bookmarkStart w:id="16" w:name="_Toc238462280"/>
+      <w:bookmarkStart w:id="16" w:name="_Toc238463974"/>
       <w:r>
         <w:t>3.3 Le domaine applicatif</w:t>
       </w:r>
@@ -7295,8 +7745,8 @@
         </w:rPr>
         <w:lastRenderedPageBreak/>
         <w:drawing>
-          <wp:inline distT="0" distB="0" distL="0" distR="0" wp14:anchorId="3984BEF0" wp14:editId="349DD8E7">
-            <wp:extent cx="4860000" cy="5400000"/>
+          <wp:inline distT="0" distB="0" distL="0" distR="0" wp14:anchorId="3F0D9EC0" wp14:editId="088FFB67">
+            <wp:extent cx="5400000" cy="6000000"/>
             <wp:effectExtent l="0" t="0" r="0" b="0"/>
             <wp:docPr id="6" name="Picture 6"/>
             <wp:cNvGraphicFramePr>
@@ -7318,7 +7768,7 @@
                   <pic:spPr>
                     <a:xfrm>
                       <a:off x="0" y="0"/>
-                      <a:ext cx="4860000" cy="5400000"/>
+                      <a:ext cx="5400000" cy="6000000"/>
                     </a:xfrm>
                     <a:prstGeom prst="rect">
                       <a:avLst/>
@@ -7358,7 +7808,7 @@
         </w:rPr>
         <w:lastRenderedPageBreak/>
         <w:drawing>
-          <wp:inline distT="0" distB="0" distL="0" distR="0" wp14:anchorId="2696D5FC" wp14:editId="039BE3A4">
+          <wp:inline distT="0" distB="0" distL="0" distR="0" wp14:anchorId="16AC551E" wp14:editId="6C4A2A4D">
             <wp:extent cx="5976000" cy="3228700"/>
             <wp:effectExtent l="0" t="0" r="0" b="0"/>
             <wp:docPr id="7" name="Picture 7"/>
@@ -7412,7 +7862,7 @@
       <w:pPr>
         <w:pStyle w:val="Titre2"/>
       </w:pPr>
-      <w:bookmarkStart w:id="17" w:name="_Toc238462281"/>
+      <w:bookmarkStart w:id="17" w:name="_Toc238463975"/>
       <w:r>
         <w:t>3.4 Conteneurs : de Compose à Kubernetes</w:t>
       </w:r>
@@ -7650,7 +8100,7 @@
       <w:pPr>
         <w:pStyle w:val="Titre2"/>
       </w:pPr>
-      <w:bookmarkStart w:id="18" w:name="_Toc238462282"/>
+      <w:bookmarkStart w:id="18" w:name="_Toc238463976"/>
       <w:r>
         <w:t>3.5 Stockage et persistance (prouvée)</w:t>
       </w:r>
@@ -7945,7 +8395,7 @@
       <w:pPr>
         <w:pStyle w:val="Titre2"/>
       </w:pPr>
-      <w:bookmarkStart w:id="19" w:name="_Toc238462283"/>
+      <w:bookmarkStart w:id="19" w:name="_Toc238463977"/>
       <w:r>
         <w:t>3.6 Supervision : réel contre simulé</w:t>
       </w:r>
@@ -8029,7 +8479,7 @@
           <w:noProof/>
         </w:rPr>
         <w:drawing>
-          <wp:inline distT="0" distB="0" distL="0" distR="0" wp14:anchorId="0E78BBCF" wp14:editId="48C9B4A3">
+          <wp:inline distT="0" distB="0" distL="0" distR="0" wp14:anchorId="7445B3F8" wp14:editId="311635CB">
             <wp:extent cx="5580000" cy="4650000"/>
             <wp:effectExtent l="0" t="0" r="0" b="0"/>
             <wp:docPr id="8" name="Picture 8"/>
@@ -8299,7 +8749,7 @@
           <w:noProof/>
         </w:rPr>
         <w:drawing>
-          <wp:inline distT="0" distB="0" distL="0" distR="0" wp14:anchorId="7D23B325" wp14:editId="5D9C7BCA">
+          <wp:inline distT="0" distB="0" distL="0" distR="0" wp14:anchorId="3C1A7A99" wp14:editId="5EDE0EDB">
             <wp:extent cx="5976000" cy="1452500"/>
             <wp:effectExtent l="0" t="0" r="0" b="0"/>
             <wp:docPr id="9" name="Picture 9"/>
@@ -8394,7 +8844,7 @@
           <w:noProof/>
         </w:rPr>
         <w:drawing>
-          <wp:inline distT="0" distB="0" distL="0" distR="0" wp14:anchorId="5745DD35" wp14:editId="2E441884">
+          <wp:inline distT="0" distB="0" distL="0" distR="0" wp14:anchorId="07ECC825" wp14:editId="21C6EC17">
             <wp:extent cx="5976000" cy="996000"/>
             <wp:effectExtent l="0" t="0" r="0" b="0"/>
             <wp:docPr id="10" name="Picture 10"/>
@@ -8478,8 +8928,8 @@
           <w:noProof/>
         </w:rPr>
         <w:drawing>
-          <wp:inline distT="0" distB="0" distL="0" distR="0" wp14:anchorId="056D46C4" wp14:editId="4C407344">
-            <wp:extent cx="5184000" cy="3240000"/>
+          <wp:inline distT="0" distB="0" distL="0" distR="0" wp14:anchorId="675BEE1E" wp14:editId="4CCAE4D7">
+            <wp:extent cx="5976000" cy="3735000"/>
             <wp:effectExtent l="0" t="0" r="0" b="0"/>
             <wp:docPr id="11" name="Picture 11"/>
             <wp:cNvGraphicFramePr>
@@ -8501,7 +8951,7 @@
                   <pic:spPr>
                     <a:xfrm>
                       <a:off x="0" y="0"/>
-                      <a:ext cx="5184000" cy="3240000"/>
+                      <a:ext cx="5976000" cy="3735000"/>
                     </a:xfrm>
                     <a:prstGeom prst="rect">
                       <a:avLst/>
@@ -8534,6 +8984,7 @@
           <w:i/>
           <w:sz w:val="19"/>
         </w:rPr>
+        <w:lastRenderedPageBreak/>
         <w:t>Limites :</w:t>
       </w:r>
       <w:r>
@@ -8547,9 +8998,8 @@
       <w:pPr>
         <w:pStyle w:val="Titre2"/>
       </w:pPr>
-      <w:bookmarkStart w:id="20" w:name="_Toc238462284"/>
-      <w:r>
-        <w:lastRenderedPageBreak/>
+      <w:bookmarkStart w:id="20" w:name="_Toc238463978"/>
+      <w:r>
         <w:t>3.7 Sauvegarde et restauration</w:t>
       </w:r>
       <w:bookmarkEnd w:id="20"/>
@@ -8741,7 +9191,7 @@
       <w:pPr>
         <w:pStyle w:val="Titre2"/>
       </w:pPr>
-      <w:bookmarkStart w:id="21" w:name="_Toc238462285"/>
+      <w:bookmarkStart w:id="21" w:name="_Toc238463979"/>
       <w:r>
         <w:t>3.8 Sécurité</w:t>
       </w:r>
@@ -8862,7 +9312,7 @@
       <w:pPr>
         <w:pStyle w:val="Titre2"/>
       </w:pPr>
-      <w:bookmarkStart w:id="22" w:name="_Toc238462286"/>
+      <w:bookmarkStart w:id="22" w:name="_Toc238463980"/>
       <w:r>
         <w:t>3.9 Environnements et versions</w:t>
       </w:r>
@@ -9241,7 +9691,7 @@
           <w:bottom w:val="single" w:sz="8" w:space="6" w:color="99C7C0"/>
         </w:pBdr>
       </w:pPr>
-      <w:bookmarkStart w:id="23" w:name="_Toc238462287"/>
+      <w:bookmarkStart w:id="23" w:name="_Toc238463981"/>
       <w:r>
         <w:lastRenderedPageBreak/>
         <w:t>4. Démarche de travail et outils</w:t>
@@ -9252,7 +9702,7 @@
       <w:pPr>
         <w:pStyle w:val="Titre2"/>
       </w:pPr>
-      <w:bookmarkStart w:id="24" w:name="_Toc238462288"/>
+      <w:bookmarkStart w:id="24" w:name="_Toc238463982"/>
       <w:r>
         <w:t>4.1 Le découpage en phases et leur état de validation</w:t>
       </w:r>
@@ -9724,7 +10174,7 @@
       <w:pPr>
         <w:pStyle w:val="Titre2"/>
       </w:pPr>
-      <w:bookmarkStart w:id="25" w:name="_Toc238462289"/>
+      <w:bookmarkStart w:id="25" w:name="_Toc238463983"/>
       <w:r>
         <w:t>4.2 Workflow Git</w:t>
       </w:r>
@@ -9775,7 +10225,7 @@
       <w:pPr>
         <w:pStyle w:val="Titre2"/>
       </w:pPr>
-      <w:bookmarkStart w:id="26" w:name="_Toc238462290"/>
+      <w:bookmarkStart w:id="26" w:name="_Toc238463984"/>
       <w:r>
         <w:t>4.3 Outils</w:t>
       </w:r>
@@ -9829,7 +10279,7 @@
       <w:pPr>
         <w:pStyle w:val="Titre2"/>
       </w:pPr>
-      <w:bookmarkStart w:id="27" w:name="_Toc238462291"/>
+      <w:bookmarkStart w:id="27" w:name="_Toc238463985"/>
       <w:r>
         <w:t>4.4 Conduite du projet et usage de l’IA</w:t>
       </w:r>
@@ -9875,7 +10325,7 @@
           <w:bottom w:val="single" w:sz="8" w:space="6" w:color="99C7C0"/>
         </w:pBdr>
       </w:pPr>
-      <w:bookmarkStart w:id="28" w:name="_Toc238462292"/>
+      <w:bookmarkStart w:id="28" w:name="_Toc238463986"/>
       <w:r>
         <w:lastRenderedPageBreak/>
         <w:t>5. Réalisations significatives</w:t>
@@ -9926,7 +10376,7 @@
       <w:pPr>
         <w:pStyle w:val="Titre2"/>
       </w:pPr>
-      <w:bookmarkStart w:id="29" w:name="_Toc238462293"/>
+      <w:bookmarkStart w:id="29" w:name="_Toc238463987"/>
       <w:r>
         <w:t>5.1 Instrumentation et alerte de supervision (CP n° 10)</w:t>
       </w:r>
@@ -10293,7 +10743,7 @@
       <w:pPr>
         <w:pStyle w:val="Titre2"/>
       </w:pPr>
-      <w:bookmarkStart w:id="30" w:name="_Toc238462294"/>
+      <w:bookmarkStart w:id="30" w:name="_Toc238463988"/>
       <w:r>
         <w:t>5.2 Image Docker durcie (CP n° 7)</w:t>
       </w:r>
@@ -10499,7 +10949,7 @@
       <w:pPr>
         <w:pStyle w:val="Titre2"/>
       </w:pPr>
-      <w:bookmarkStart w:id="31" w:name="_Toc238462295"/>
+      <w:bookmarkStart w:id="31" w:name="_Toc238463989"/>
       <w:r>
         <w:lastRenderedPageBreak/>
         <w:t>5.3 Workloads Kubernetes durcis et stockage persistant (CP n° 7)</w:t>
@@ -10881,7 +11331,7 @@
       <w:pPr>
         <w:pStyle w:val="Titre2"/>
       </w:pPr>
-      <w:bookmarkStart w:id="32" w:name="_Toc238462296"/>
+      <w:bookmarkStart w:id="32" w:name="_Toc238463990"/>
       <w:r>
         <w:t>5.4 Pipeline d’intégration continue (chaîne 1)</w:t>
       </w:r>
@@ -11362,7 +11812,7 @@
           <w:noProof/>
         </w:rPr>
         <w:drawing>
-          <wp:inline distT="0" distB="0" distL="0" distR="0" wp14:anchorId="5F92DC08" wp14:editId="20100111">
+          <wp:inline distT="0" distB="0" distL="0" distR="0" wp14:anchorId="1EB9F42F" wp14:editId="5ED96E03">
             <wp:extent cx="5976000" cy="4042432"/>
             <wp:effectExtent l="0" t="0" r="0" b="0"/>
             <wp:docPr id="12" name="Picture 12"/>
@@ -11489,7 +11939,7 @@
       <w:pPr>
         <w:pStyle w:val="Titre2"/>
       </w:pPr>
-      <w:bookmarkStart w:id="33" w:name="_Toc238462297"/>
+      <w:bookmarkStart w:id="33" w:name="_Toc238463991"/>
       <w:r>
         <w:t>5.5 Automatisation du déploiement d’infrastructure avec Ansible (CP n° 2, chaîne 2)</w:t>
       </w:r>
@@ -12185,7 +12635,7 @@
       <w:pPr>
         <w:pStyle w:val="Titre2"/>
       </w:pPr>
-      <w:bookmarkStart w:id="34" w:name="_Toc238462298"/>
+      <w:bookmarkStart w:id="34" w:name="_Toc238463992"/>
       <w:r>
         <w:lastRenderedPageBreak/>
         <w:t>5.6 Sauvegarde et restauration sûres</w:t>
@@ -12394,7 +12844,7 @@
           <w:bottom w:val="single" w:sz="8" w:space="6" w:color="99C7C0"/>
         </w:pBdr>
       </w:pPr>
-      <w:bookmarkStart w:id="35" w:name="_Toc238462299"/>
+      <w:bookmarkStart w:id="35" w:name="_Toc238463993"/>
       <w:r>
         <w:lastRenderedPageBreak/>
         <w:t>6. Situation de travail ayant nécessité une recherche</w:t>
@@ -12405,7 +12855,7 @@
       <w:pPr>
         <w:pStyle w:val="Titre2"/>
       </w:pPr>
-      <w:bookmarkStart w:id="36" w:name="_Toc238462300"/>
+      <w:bookmarkStart w:id="36" w:name="_Toc238463994"/>
       <w:r>
         <w:t>Le fichier ansible.cfg silencieusement ignoré dans le control node conteneurisé</w:t>
       </w:r>
@@ -13012,7 +13462,7 @@
           <w:bottom w:val="single" w:sz="8" w:space="6" w:color="99C7C0"/>
         </w:pBdr>
       </w:pPr>
-      <w:bookmarkStart w:id="37" w:name="_Toc238462301"/>
+      <w:bookmarkStart w:id="37" w:name="_Toc238463995"/>
       <w:r>
         <w:lastRenderedPageBreak/>
         <w:t>7. Synthèse des validations</w:t>
@@ -13636,9 +14086,11 @@
     <w:p>
       <w:pPr>
         <w:pStyle w:val="Titre2"/>
-      </w:pPr>
-      <w:bookmarkStart w:id="38" w:name="_Toc238462302"/>
-      <w:r>
+        <w:pageBreakBefore/>
+      </w:pPr>
+      <w:bookmarkStart w:id="38" w:name="_Toc238463996"/>
+      <w:r>
+        <w:lastRenderedPageBreak/>
         <w:t>Clôture de la phase 6 : ce que la revue humaine a trouvé</w:t>
       </w:r>
       <w:bookmarkEnd w:id="38"/>
@@ -13687,6 +14139,180 @@
       <w:r>
         <w:t>).</w:t>
       </w:r>
+    </w:p>
+    <w:tbl>
+      <w:tblPr>
+        <w:tblW w:w="0" w:type="auto"/>
+        <w:jc w:val="center"/>
+        <w:tblLayout w:type="fixed"/>
+        <w:tblCellMar>
+          <w:left w:w="40" w:type="dxa"/>
+          <w:right w:w="40" w:type="dxa"/>
+        </w:tblCellMar>
+        <w:tblLook w:val="04A0" w:firstRow="1" w:lastRow="0" w:firstColumn="1" w:lastColumn="0" w:noHBand="0" w:noVBand="1"/>
+      </w:tblPr>
+      <w:tblGrid>
+        <w:gridCol w:w="4535"/>
+        <w:gridCol w:w="4535"/>
+      </w:tblGrid>
+      <w:tr>
+        <w:trPr>
+          <w:cantSplit/>
+          <w:jc w:val="center"/>
+        </w:trPr>
+        <w:tc>
+          <w:tcPr>
+            <w:tcW w:w="4535" w:type="dxa"/>
+          </w:tcPr>
+          <w:p>
+            <w:pPr>
+              <w:spacing w:after="0"/>
+              <w:jc w:val="center"/>
+            </w:pPr>
+            <w:r>
+              <w:rPr>
+                <w:noProof/>
+              </w:rPr>
+              <w:drawing>
+                <wp:inline distT="0" distB="0" distL="0" distR="0" wp14:anchorId="565E591B" wp14:editId="7C8D4FD9">
+                  <wp:extent cx="2772000" cy="1638332"/>
+                  <wp:effectExtent l="0" t="0" r="0" b="0"/>
+                  <wp:docPr id="13" name="Picture 13"/>
+                  <wp:cNvGraphicFramePr>
+                    <a:graphicFrameLocks xmlns:a="http://schemas.openxmlformats.org/drawingml/2006/main" noChangeAspect="1"/>
+                  </wp:cNvGraphicFramePr>
+                  <a:graphic xmlns:a="http://schemas.openxmlformats.org/drawingml/2006/main">
+                    <a:graphicData uri="http://schemas.openxmlformats.org/drawingml/2006/picture">
+                      <pic:pic xmlns:pic="http://schemas.openxmlformats.org/drawingml/2006/picture">
+                        <pic:nvPicPr>
+                          <pic:cNvPr id="0" name="12_incidents_mobile_avant_fig.png"/>
+                          <pic:cNvPicPr/>
+                        </pic:nvPicPr>
+                        <pic:blipFill>
+                          <a:blip r:embed="rId20"/>
+                          <a:stretch>
+                            <a:fillRect/>
+                          </a:stretch>
+                        </pic:blipFill>
+                        <pic:spPr>
+                          <a:xfrm>
+                            <a:off x="0" y="0"/>
+                            <a:ext cx="2772000" cy="1638332"/>
+                          </a:xfrm>
+                          <a:prstGeom prst="rect">
+                            <a:avLst/>
+                          </a:prstGeom>
+                        </pic:spPr>
+                      </pic:pic>
+                    </a:graphicData>
+                  </a:graphic>
+                </wp:inline>
+              </w:drawing>
+            </w:r>
+          </w:p>
+        </w:tc>
+        <w:tc>
+          <w:tcPr>
+            <w:tcW w:w="4535" w:type="dxa"/>
+          </w:tcPr>
+          <w:p>
+            <w:pPr>
+              <w:spacing w:after="0"/>
+              <w:jc w:val="center"/>
+            </w:pPr>
+            <w:r>
+              <w:rPr>
+                <w:noProof/>
+              </w:rPr>
+              <w:drawing>
+                <wp:inline distT="0" distB="0" distL="0" distR="0" wp14:anchorId="543D3F60" wp14:editId="4CB53658">
+                  <wp:extent cx="2772000" cy="1933292"/>
+                  <wp:effectExtent l="0" t="0" r="0" b="0"/>
+                  <wp:docPr id="14" name="Picture 14"/>
+                  <wp:cNvGraphicFramePr>
+                    <a:graphicFrameLocks xmlns:a="http://schemas.openxmlformats.org/drawingml/2006/main" noChangeAspect="1"/>
+                  </wp:cNvGraphicFramePr>
+                  <a:graphic xmlns:a="http://schemas.openxmlformats.org/drawingml/2006/main">
+                    <a:graphicData uri="http://schemas.openxmlformats.org/drawingml/2006/picture">
+                      <pic:pic xmlns:pic="http://schemas.openxmlformats.org/drawingml/2006/picture">
+                        <pic:nvPicPr>
+                          <pic:cNvPr id="0" name="10_incidents_mobile_fig.png"/>
+                          <pic:cNvPicPr/>
+                        </pic:nvPicPr>
+                        <pic:blipFill>
+                          <a:blip r:embed="rId21"/>
+                          <a:stretch>
+                            <a:fillRect/>
+                          </a:stretch>
+                        </pic:blipFill>
+                        <pic:spPr>
+                          <a:xfrm>
+                            <a:off x="0" y="0"/>
+                            <a:ext cx="2772000" cy="1933292"/>
+                          </a:xfrm>
+                          <a:prstGeom prst="rect">
+                            <a:avLst/>
+                          </a:prstGeom>
+                        </pic:spPr>
+                      </pic:pic>
+                    </a:graphicData>
+                  </a:graphic>
+                </wp:inline>
+              </w:drawing>
+            </w:r>
+          </w:p>
+        </w:tc>
+      </w:tr>
+      <w:tr>
+        <w:trPr>
+          <w:jc w:val="center"/>
+        </w:trPr>
+        <w:tc>
+          <w:tcPr>
+            <w:tcW w:w="4535" w:type="dxa"/>
+          </w:tcPr>
+          <w:p>
+            <w:pPr>
+              <w:pStyle w:val="OFCaption"/>
+              <w:spacing w:after="120"/>
+            </w:pPr>
+            <w:r>
+              <w:rPr>
+                <w:b/>
+              </w:rPr>
+              <w:t>Figure 12</w:t>
+            </w:r>
+            <w:r>
+              <w:t xml:space="preserve"> — Avant : à 390 px, les en-têtes de la table Incidents se chevauchent et le titre de l’incident est tronqué à quelques caractères.</w:t>
+            </w:r>
+          </w:p>
+        </w:tc>
+        <w:tc>
+          <w:tcPr>
+            <w:tcW w:w="4535" w:type="dxa"/>
+          </w:tcPr>
+          <w:p>
+            <w:pPr>
+              <w:pStyle w:val="OFCaption"/>
+              <w:spacing w:after="120"/>
+            </w:pPr>
+            <w:r>
+              <w:rPr>
+                <w:b/>
+              </w:rPr>
+              <w:t>Figure 13</w:t>
+            </w:r>
+            <w:r>
+              <w:t xml:space="preserve"> — Après correction : colonnes lisibles, la table défilant dans son propre cadre.</w:t>
+            </w:r>
+          </w:p>
+        </w:tc>
+      </w:tr>
+    </w:tbl>
+    <w:p>
+      <w:pPr>
+        <w:spacing w:after="40"/>
+      </w:pPr>
     </w:p>
     <w:tbl>
       <w:tblPr>
@@ -13749,7 +14375,7 @@
           <w:bottom w:val="single" w:sz="8" w:space="6" w:color="99C7C0"/>
         </w:pBdr>
       </w:pPr>
-      <w:bookmarkStart w:id="39" w:name="_Toc238462303"/>
+      <w:bookmarkStart w:id="39" w:name="_Toc238463997"/>
       <w:r>
         <w:lastRenderedPageBreak/>
         <w:t>8. Limites assumées et évolutions</w:t>
@@ -14364,7 +14990,7 @@
           <w:bottom w:val="single" w:sz="8" w:space="6" w:color="99C7C0"/>
         </w:pBdr>
       </w:pPr>
-      <w:bookmarkStart w:id="40" w:name="_Toc238462304"/>
+      <w:bookmarkStart w:id="40" w:name="_Toc238463998"/>
       <w:r>
         <w:lastRenderedPageBreak/>
         <w:t>Conclusion</w:t>
@@ -14433,7 +15059,7 @@
           <w:bottom w:val="single" w:sz="8" w:space="6" w:color="99C7C0"/>
         </w:pBdr>
       </w:pPr>
-      <w:bookmarkStart w:id="41" w:name="_Toc238462305"/>
+      <w:bookmarkStart w:id="41" w:name="_Toc238463999"/>
       <w:r>
         <w:lastRenderedPageBreak/>
         <w:t>Annexe A — Chronologie détaillée du projet</w:t>
@@ -15508,7 +16134,7 @@
           <w:bottom w:val="single" w:sz="8" w:space="6" w:color="99C7C0"/>
         </w:pBdr>
       </w:pPr>
-      <w:bookmarkStart w:id="42" w:name="_Toc238462306"/>
+      <w:bookmarkStart w:id="42" w:name="_Toc238464000"/>
       <w:r>
         <w:lastRenderedPageBreak/>
         <w:t>Annexe B — Inventaire des preuves</w:t>
@@ -15519,7 +16145,7 @@
       <w:pPr>
         <w:pStyle w:val="Titre2"/>
       </w:pPr>
-      <w:bookmarkStart w:id="43" w:name="_Toc238462307"/>
+      <w:bookmarkStart w:id="43" w:name="_Toc238464001"/>
       <w:r>
         <w:t>B.1 Captures et schémas (versionnés sous deliverables/assets/)</w:t>
       </w:r>
@@ -16333,7 +16959,7 @@
               <w:rPr>
                 <w:sz w:val="17"/>
               </w:rPr>
-              <w:t>Table Incidents en mobile après correction (défaut trouvé en revue manuelle)</w:t>
+              <w:t>Table Incidents en mobile après correction</w:t>
             </w:r>
           </w:p>
         </w:tc>
@@ -16350,7 +16976,7 @@
               <w:rPr>
                 <w:sz w:val="17"/>
               </w:rPr>
-              <w:t>Réserve orale</w:t>
+              <w:t>Figure 13 (*)</w:t>
             </w:r>
           </w:p>
         </w:tc>
@@ -16376,7 +17002,7 @@
                 <w:sz w:val="17"/>
                 <w:lang w:val="en-US"/>
               </w:rPr>
-              <w:t>screenshots/11_github_actions_run.png</w:t>
+              <w:t>screenshots/12_incidents_mobile_avant.png</w:t>
             </w:r>
           </w:p>
         </w:tc>
@@ -16392,23 +17018,7 @@
               <w:rPr>
                 <w:sz w:val="17"/>
               </w:rPr>
-              <w:t xml:space="preserve">Interface GitHub Actions : job du run </w:t>
-            </w:r>
-            <w:r>
-              <w:rPr>
-                <w:rFonts w:ascii="Consolas" w:eastAsia="Consolas" w:hAnsi="Consolas" w:cs="Consolas"/>
-                <w:noProof/>
-                <w:color w:val="0B3F3B"/>
-                <w:sz w:val="17"/>
-                <w:lang w:val="en-US"/>
-              </w:rPr>
-              <w:t>32197168814</w:t>
-            </w:r>
-            <w:r>
-              <w:rPr>
-                <w:sz w:val="17"/>
-              </w:rPr>
-              <w:t xml:space="preserve"> (candidat final) avec son annotation</w:t>
+              <w:t>Table Incidents en mobile à l’état défectueux, constaté pendant la revue</w:t>
             </w:r>
           </w:p>
         </w:tc>
@@ -16424,6 +17034,83 @@
               <w:rPr>
                 <w:sz w:val="17"/>
               </w:rPr>
+              <w:t>Figure 12 (*)</w:t>
+            </w:r>
+          </w:p>
+        </w:tc>
+      </w:tr>
+      <w:tr>
+        <w:trPr>
+          <w:cantSplit/>
+          <w:jc w:val="center"/>
+        </w:trPr>
+        <w:tc>
+          <w:tcPr>
+            <w:tcW w:w="3685" w:type="dxa"/>
+            <w:shd w:val="clear" w:color="auto" w:fill="F4F8F8"/>
+          </w:tcPr>
+          <w:p>
+            <w:pPr>
+              <w:pStyle w:val="OFTable"/>
+            </w:pPr>
+            <w:r>
+              <w:rPr>
+                <w:rFonts w:ascii="Consolas" w:eastAsia="Consolas" w:hAnsi="Consolas" w:cs="Consolas"/>
+                <w:noProof/>
+                <w:color w:val="0B3F3B"/>
+                <w:sz w:val="17"/>
+                <w:lang w:val="en-US"/>
+              </w:rPr>
+              <w:t>screenshots/11_github_actions_run.png</w:t>
+            </w:r>
+          </w:p>
+        </w:tc>
+        <w:tc>
+          <w:tcPr>
+            <w:tcW w:w="4082" w:type="dxa"/>
+            <w:shd w:val="clear" w:color="auto" w:fill="F4F8F8"/>
+          </w:tcPr>
+          <w:p>
+            <w:pPr>
+              <w:pStyle w:val="OFTable"/>
+            </w:pPr>
+            <w:r>
+              <w:rPr>
+                <w:sz w:val="17"/>
+              </w:rPr>
+              <w:t xml:space="preserve">Interface GitHub Actions : job du run </w:t>
+            </w:r>
+            <w:r>
+              <w:rPr>
+                <w:rFonts w:ascii="Consolas" w:eastAsia="Consolas" w:hAnsi="Consolas" w:cs="Consolas"/>
+                <w:noProof/>
+                <w:color w:val="0B3F3B"/>
+                <w:sz w:val="17"/>
+                <w:lang w:val="en-US"/>
+              </w:rPr>
+              <w:t>32197168814</w:t>
+            </w:r>
+            <w:r>
+              <w:rPr>
+                <w:sz w:val="17"/>
+              </w:rPr>
+              <w:t xml:space="preserve"> (candidat final) avec son annotation</w:t>
+            </w:r>
+          </w:p>
+        </w:tc>
+        <w:tc>
+          <w:tcPr>
+            <w:tcW w:w="1644" w:type="dxa"/>
+            <w:shd w:val="clear" w:color="auto" w:fill="F4F8F8"/>
+          </w:tcPr>
+          <w:p>
+            <w:pPr>
+              <w:pStyle w:val="OFTable"/>
+            </w:pPr>
+            <w:r>
+              <w:rPr>
+                <w:sz w:val="17"/>
+              </w:rPr>
               <w:t>Figure 11 (*)</w:t>
             </w:r>
           </w:p>
@@ -16466,7 +17153,7 @@
       <w:pPr>
         <w:pStyle w:val="Titre2"/>
       </w:pPr>
-      <w:bookmarkStart w:id="44" w:name="_Toc238462308"/>
+      <w:bookmarkStart w:id="44" w:name="_Toc238464002"/>
       <w:r>
         <w:t>B.2 Journaux d’exécution bruts (versionnés sous deliverables/evidence/)</w:t>
       </w:r>
@@ -16983,12 +17670,570 @@
           <w:bottom w:val="single" w:sz="8" w:space="6" w:color="99C7C0"/>
         </w:pBdr>
       </w:pPr>
-      <w:bookmarkStart w:id="45" w:name="_Toc238462309"/>
+      <w:bookmarkStart w:id="45" w:name="_Toc238464003"/>
       <w:r>
         <w:lastRenderedPageBreak/>
-        <w:t>Annexe C — Glossaire</w:t>
+        <w:t>Annexe C — Reproduire les preuves</w:t>
       </w:r>
       <w:bookmarkEnd w:id="45"/>
+    </w:p>
+    <w:p>
+      <w:r>
+        <w:t xml:space="preserve">Chaque preuve de ce dossier est rejouable. Les commandes ci-dessous sont celles qui ont produit les journaux versionnés sous </w:t>
+      </w:r>
+      <w:r>
+        <w:rPr>
+          <w:rFonts w:ascii="Consolas" w:eastAsia="Consolas" w:hAnsi="Consolas" w:cs="Consolas"/>
+          <w:noProof/>
+          <w:color w:val="0B3F3B"/>
+          <w:sz w:val="18"/>
+          <w:lang w:val="en-US"/>
+        </w:rPr>
+        <w:t>deliverables/evidence/</w:t>
+      </w:r>
+      <w:r>
+        <w:t>. Prérequis : le dépôt cloné et Docker Desktop.</w:t>
+      </w:r>
+    </w:p>
+    <w:p>
+      <w:pPr>
+        <w:pStyle w:val="Titre2"/>
+      </w:pPr>
+      <w:bookmarkStart w:id="46" w:name="_Toc238464004"/>
+      <w:r>
+        <w:t>C.1 Application et tests</w:t>
+      </w:r>
+      <w:bookmarkEnd w:id="46"/>
+    </w:p>
+    <w:p>
+      <w:pPr>
+        <w:pStyle w:val="OFCode"/>
+        <w:keepNext/>
+        <w:pBdr>
+          <w:top w:val="single" w:sz="6" w:space="3" w:color="DDE5E8"/>
+          <w:left w:val="single" w:sz="18" w:space="3" w:color="0F766E"/>
+        </w:pBdr>
+        <w:shd w:val="clear" w:color="auto" w:fill="F4F7F8"/>
+        <w:spacing w:before="140"/>
+      </w:pPr>
+      <w:r>
+        <w:rPr>
+          <w:noProof/>
+          <w:lang w:val="en-US"/>
+        </w:rPr>
+        <w:t>docker compose up --build -d          # console : http://localhost:8000/overview</w:t>
+      </w:r>
+    </w:p>
+    <w:p>
+      <w:pPr>
+        <w:pStyle w:val="OFCode"/>
+        <w:keepNext/>
+        <w:pBdr>
+          <w:left w:val="single" w:sz="18" w:space="3" w:color="0F766E"/>
+        </w:pBdr>
+        <w:shd w:val="clear" w:color="auto" w:fill="F4F7F8"/>
+      </w:pPr>
+      <w:r>
+        <w:rPr>
+          <w:noProof/>
+          <w:lang w:val="en-US"/>
+        </w:rPr>
+        <w:t>curl.exe http://localhost:8000/health     # {"status": "ok", ...}</w:t>
+      </w:r>
+    </w:p>
+    <w:p>
+      <w:pPr>
+        <w:pStyle w:val="OFCode"/>
+        <w:keepNext/>
+        <w:pBdr>
+          <w:left w:val="single" w:sz="18" w:space="3" w:color="0F766E"/>
+        </w:pBdr>
+        <w:shd w:val="clear" w:color="auto" w:fill="F4F7F8"/>
+      </w:pPr>
+      <w:r>
+        <w:rPr>
+          <w:noProof/>
+          <w:lang w:val="en-US"/>
+        </w:rPr>
+        <w:t>curl.exe http://localhost:8000/ready      # {"status": "ready", ...} - SELECT 1 sur PostgreSQL</w:t>
+      </w:r>
+    </w:p>
+    <w:p>
+      <w:pPr>
+        <w:pStyle w:val="OFCode"/>
+        <w:keepNext/>
+        <w:pBdr>
+          <w:left w:val="single" w:sz="18" w:space="3" w:color="0F766E"/>
+        </w:pBdr>
+        <w:shd w:val="clear" w:color="auto" w:fill="F4F7F8"/>
+      </w:pPr>
+      <w:r>
+        <w:rPr>
+          <w:noProof/>
+          <w:lang w:val="en-US"/>
+        </w:rPr>
+        <w:t>docker compose exec api pytest                                # 38 tests SQLite</w:t>
+      </w:r>
+    </w:p>
+    <w:p>
+      <w:pPr>
+        <w:pStyle w:val="OFCode"/>
+        <w:pBdr>
+          <w:left w:val="single" w:sz="18" w:space="3" w:color="0F766E"/>
+          <w:bottom w:val="single" w:sz="6" w:space="3" w:color="DDE5E8"/>
+        </w:pBdr>
+        <w:shd w:val="clear" w:color="auto" w:fill="F4F7F8"/>
+        <w:spacing w:after="160"/>
+      </w:pPr>
+      <w:r>
+        <w:rPr>
+          <w:noProof/>
+          <w:lang w:val="en-US"/>
+        </w:rPr>
+        <w:t>docker compose exec api pytest tests/postgres_integration.py  # integration PostgreSQL</w:t>
+      </w:r>
+    </w:p>
+    <w:p>
+      <w:pPr>
+        <w:pStyle w:val="Titre2"/>
+      </w:pPr>
+      <w:bookmarkStart w:id="47" w:name="_Toc238464005"/>
+      <w:r>
+        <w:t>C.2 Déploiement de l’infrastructure par Ansible (CP n° 2)</w:t>
+      </w:r>
+      <w:bookmarkEnd w:id="47"/>
+    </w:p>
+    <w:p>
+      <w:pPr>
+        <w:keepNext/>
+        <w:jc w:val="left"/>
+      </w:pPr>
+      <w:r>
+        <w:t xml:space="preserve">À lancer </w:t>
+      </w:r>
+      <w:r>
+        <w:rPr>
+          <w:b/>
+        </w:rPr>
+        <w:t>sur un cluster jetable</w:t>
+      </w:r>
+      <w:r>
+        <w:t>, pour ne pas agir sur un cluster existant :</w:t>
+      </w:r>
+    </w:p>
+    <w:p>
+      <w:pPr>
+        <w:pStyle w:val="OFCode"/>
+        <w:keepNext/>
+        <w:pBdr>
+          <w:top w:val="single" w:sz="6" w:space="3" w:color="DDE5E8"/>
+          <w:left w:val="single" w:sz="18" w:space="3" w:color="0F766E"/>
+        </w:pBdr>
+        <w:shd w:val="clear" w:color="auto" w:fill="F4F7F8"/>
+        <w:spacing w:before="140"/>
+      </w:pPr>
+      <w:r>
+        <w:rPr>
+          <w:noProof/>
+          <w:lang w:val="en-US"/>
+        </w:rPr>
+        <w:t># deploiement complet auto-verifie (ok=22 changed=9) ; rejoue -&gt; idempotence (ok=21 changed=2)</w:t>
+      </w:r>
+    </w:p>
+    <w:p>
+      <w:pPr>
+        <w:pStyle w:val="OFCode"/>
+        <w:keepNext/>
+        <w:pBdr>
+          <w:left w:val="single" w:sz="18" w:space="3" w:color="0F766E"/>
+        </w:pBdr>
+        <w:shd w:val="clear" w:color="auto" w:fill="F4F7F8"/>
+      </w:pPr>
+      <w:r>
+        <w:rPr>
+          <w:noProof/>
+          <w:lang w:val="en-US"/>
+        </w:rPr>
+        <w:t>./ansible/run.sh deploy.yml -e cluster_name=opsforge-ansible-test \</w:t>
+      </w:r>
+    </w:p>
+    <w:p>
+      <w:pPr>
+        <w:pStyle w:val="OFCode"/>
+        <w:keepNext/>
+        <w:pBdr>
+          <w:left w:val="single" w:sz="18" w:space="3" w:color="0F766E"/>
+        </w:pBdr>
+        <w:shd w:val="clear" w:color="auto" w:fill="F4F7F8"/>
+      </w:pPr>
+      <w:r>
+        <w:rPr>
+          <w:noProof/>
+          <w:lang w:val="en-US"/>
+        </w:rPr>
+        <w:t xml:space="preserve">  -e api_host_port=8090 -e kubeapi_host_port=6446</w:t>
+      </w:r>
+    </w:p>
+    <w:p>
+      <w:pPr>
+        <w:pStyle w:val="OFCode"/>
+        <w:pBdr>
+          <w:left w:val="single" w:sz="18" w:space="3" w:color="0F766E"/>
+          <w:bottom w:val="single" w:sz="6" w:space="3" w:color="DDE5E8"/>
+        </w:pBdr>
+        <w:shd w:val="clear" w:color="auto" w:fill="F4F7F8"/>
+        <w:spacing w:after="160"/>
+      </w:pPr>
+      <w:r>
+        <w:rPr>
+          <w:noProof/>
+          <w:lang w:val="en-US"/>
+        </w:rPr>
+        <w:t>./ansible/run.sh teardown.yml -e cluster_name=opsforge-ansible-test    # suppression du cluster</w:t>
+      </w:r>
+    </w:p>
+    <w:p>
+      <w:r>
+        <w:rPr>
+          <w:i/>
+        </w:rPr>
+        <w:t>Attention :</w:t>
+      </w:r>
+      <w:r>
+        <w:t xml:space="preserve"> </w:t>
+      </w:r>
+      <w:r>
+        <w:rPr>
+          <w:rFonts w:ascii="Consolas" w:eastAsia="Consolas" w:hAnsi="Consolas" w:cs="Consolas"/>
+          <w:noProof/>
+          <w:color w:val="0B3F3B"/>
+          <w:sz w:val="18"/>
+          <w:lang w:val="en-US"/>
+        </w:rPr>
+        <w:t>./run.sh</w:t>
+      </w:r>
+      <w:r>
+        <w:t xml:space="preserve"> sans paramètre vise le cluster </w:t>
+      </w:r>
+      <w:r>
+        <w:rPr>
+          <w:rFonts w:ascii="Consolas" w:eastAsia="Consolas" w:hAnsi="Consolas" w:cs="Consolas"/>
+          <w:noProof/>
+          <w:color w:val="0B3F3B"/>
+          <w:sz w:val="18"/>
+          <w:lang w:val="en-US"/>
+        </w:rPr>
+        <w:t>opsforge</w:t>
+      </w:r>
+      <w:r>
+        <w:t xml:space="preserve"> et agirait sur un cluster existant. Le control node conteneurisé est la seule méthode validée (§ 6).</w:t>
+      </w:r>
+    </w:p>
+    <w:p>
+      <w:pPr>
+        <w:pStyle w:val="Titre2"/>
+      </w:pPr>
+      <w:bookmarkStart w:id="48" w:name="_Toc238464006"/>
+      <w:r>
+        <w:t>C.3 Persistance du stockage (CP n° 7)</w:t>
+      </w:r>
+      <w:bookmarkEnd w:id="48"/>
+    </w:p>
+    <w:p>
+      <w:pPr>
+        <w:pStyle w:val="OFCode"/>
+        <w:keepNext/>
+        <w:pBdr>
+          <w:top w:val="single" w:sz="6" w:space="3" w:color="DDE5E8"/>
+          <w:left w:val="single" w:sz="18" w:space="3" w:color="0F766E"/>
+        </w:pBdr>
+        <w:shd w:val="clear" w:color="auto" w:fill="F4F7F8"/>
+        <w:spacing w:before="140"/>
+      </w:pPr>
+      <w:r>
+        <w:rPr>
+          <w:noProof/>
+          <w:lang w:val="en-US"/>
+        </w:rPr>
+        <w:t>kubectl -n opsforge exec postgres-0 -- psql -U opsforge -d opsforge \</w:t>
+      </w:r>
+    </w:p>
+    <w:p>
+      <w:pPr>
+        <w:pStyle w:val="OFCode"/>
+        <w:keepNext/>
+        <w:pBdr>
+          <w:left w:val="single" w:sz="18" w:space="3" w:color="0F766E"/>
+        </w:pBdr>
+        <w:shd w:val="clear" w:color="auto" w:fill="F4F7F8"/>
+      </w:pPr>
+      <w:r>
+        <w:rPr>
+          <w:noProof/>
+          <w:lang w:val="en-US"/>
+        </w:rPr>
+        <w:t xml:space="preserve">  -c "CREATE TABLE persistence_check(m text); INSERT INTO persistence_check VALUES('preuve');"</w:t>
+      </w:r>
+    </w:p>
+    <w:p>
+      <w:pPr>
+        <w:pStyle w:val="OFCode"/>
+        <w:keepNext/>
+        <w:pBdr>
+          <w:left w:val="single" w:sz="18" w:space="3" w:color="0F766E"/>
+        </w:pBdr>
+        <w:shd w:val="clear" w:color="auto" w:fill="F4F7F8"/>
+      </w:pPr>
+      <w:r>
+        <w:rPr>
+          <w:noProof/>
+          <w:lang w:val="en-US"/>
+        </w:rPr>
+        <w:t>kubectl -n opsforge delete pod postgres-0</w:t>
+      </w:r>
+    </w:p>
+    <w:p>
+      <w:pPr>
+        <w:pStyle w:val="OFCode"/>
+        <w:keepNext/>
+        <w:pBdr>
+          <w:left w:val="single" w:sz="18" w:space="3" w:color="0F766E"/>
+        </w:pBdr>
+        <w:shd w:val="clear" w:color="auto" w:fill="F4F7F8"/>
+      </w:pPr>
+      <w:r>
+        <w:rPr>
+          <w:noProof/>
+          <w:lang w:val="en-US"/>
+        </w:rPr>
+        <w:t>kubectl -n opsforge rollout status statefulset/postgres --timeout=180s</w:t>
+      </w:r>
+    </w:p>
+    <w:p>
+      <w:pPr>
+        <w:pStyle w:val="OFCode"/>
+        <w:keepNext/>
+        <w:pBdr>
+          <w:left w:val="single" w:sz="18" w:space="3" w:color="0F766E"/>
+        </w:pBdr>
+        <w:shd w:val="clear" w:color="auto" w:fill="F4F7F8"/>
+      </w:pPr>
+      <w:r>
+        <w:rPr>
+          <w:noProof/>
+          <w:lang w:val="en-US"/>
+        </w:rPr>
+        <w:t>kubectl -n opsforge exec postgres-0 -- psql -U opsforge -d opsforge \</w:t>
+      </w:r>
+    </w:p>
+    <w:p>
+      <w:pPr>
+        <w:pStyle w:val="OFCode"/>
+        <w:pBdr>
+          <w:left w:val="single" w:sz="18" w:space="3" w:color="0F766E"/>
+          <w:bottom w:val="single" w:sz="6" w:space="3" w:color="DDE5E8"/>
+        </w:pBdr>
+        <w:shd w:val="clear" w:color="auto" w:fill="F4F7F8"/>
+        <w:spacing w:after="160"/>
+      </w:pPr>
+      <w:r>
+        <w:rPr>
+          <w:noProof/>
+          <w:lang w:val="en-US"/>
+        </w:rPr>
+        <w:t xml:space="preserve">  -tAc "SELECT m FROM persistence_check;"    # marqueur retrouve = persistance prouvee</w:t>
+      </w:r>
+    </w:p>
+    <w:p>
+      <w:pPr>
+        <w:pStyle w:val="Titre2"/>
+      </w:pPr>
+      <w:bookmarkStart w:id="49" w:name="_Toc238464007"/>
+      <w:r>
+        <w:t>C.4 Supervision et déclenchement réel de l’alerte (CP n° 10)</w:t>
+      </w:r>
+      <w:bookmarkEnd w:id="49"/>
+    </w:p>
+    <w:p>
+      <w:pPr>
+        <w:pStyle w:val="OFCode"/>
+        <w:keepNext/>
+        <w:pBdr>
+          <w:top w:val="single" w:sz="6" w:space="3" w:color="DDE5E8"/>
+          <w:left w:val="single" w:sz="18" w:space="3" w:color="0F766E"/>
+        </w:pBdr>
+        <w:shd w:val="clear" w:color="auto" w:fill="F4F7F8"/>
+        <w:spacing w:before="140"/>
+      </w:pPr>
+      <w:r>
+        <w:rPr>
+          <w:noProof/>
+          <w:lang w:val="en-US"/>
+        </w:rPr>
+        <w:t>kubectl -n monitoring port-forward svc/prometheus 9090:9090   # /targets et /alerts</w:t>
+      </w:r>
+    </w:p>
+    <w:p>
+      <w:pPr>
+        <w:pStyle w:val="OFCode"/>
+        <w:keepNext/>
+        <w:pBdr>
+          <w:left w:val="single" w:sz="18" w:space="3" w:color="0F766E"/>
+        </w:pBdr>
+        <w:shd w:val="clear" w:color="auto" w:fill="F4F7F8"/>
+      </w:pPr>
+      <w:r>
+        <w:rPr>
+          <w:noProof/>
+          <w:lang w:val="en-US"/>
+        </w:rPr>
+        <w:t>kubectl -n monitoring port-forward svc/grafana    3000:3000   # dashboard</w:t>
+      </w:r>
+    </w:p>
+    <w:p>
+      <w:pPr>
+        <w:pStyle w:val="OFCode"/>
+        <w:keepNext/>
+        <w:pBdr>
+          <w:left w:val="single" w:sz="18" w:space="3" w:color="0F766E"/>
+        </w:pBdr>
+        <w:shd w:val="clear" w:color="auto" w:fill="F4F7F8"/>
+      </w:pPr>
+      <w:r>
+        <w:rPr>
+          <w:noProof/>
+          <w:lang w:val="en-US"/>
+        </w:rPr>
+        <w:t>kubectl -n opsforge scale deployment/opsforge-api --replicas=0   # panne provoquee : up == 0</w:t>
+      </w:r>
+    </w:p>
+    <w:p>
+      <w:pPr>
+        <w:pStyle w:val="OFCode"/>
+        <w:keepNext/>
+        <w:pBdr>
+          <w:left w:val="single" w:sz="18" w:space="3" w:color="0F766E"/>
+        </w:pBdr>
+        <w:shd w:val="clear" w:color="auto" w:fill="F4F7F8"/>
+      </w:pPr>
+      <w:r>
+        <w:rPr>
+          <w:noProof/>
+          <w:lang w:val="en-US"/>
+        </w:rPr>
+        <w:t>#   OpsForgeApiDown : inactive -&gt; pending -&gt; firing (au bout de 30 s)</w:t>
+      </w:r>
+    </w:p>
+    <w:p>
+      <w:pPr>
+        <w:pStyle w:val="OFCode"/>
+        <w:pBdr>
+          <w:left w:val="single" w:sz="18" w:space="3" w:color="0F766E"/>
+          <w:bottom w:val="single" w:sz="6" w:space="3" w:color="DDE5E8"/>
+        </w:pBdr>
+        <w:shd w:val="clear" w:color="auto" w:fill="F4F7F8"/>
+        <w:spacing w:after="160"/>
+      </w:pPr>
+      <w:r>
+        <w:rPr>
+          <w:noProof/>
+          <w:lang w:val="en-US"/>
+        </w:rPr>
+        <w:t>kubectl -n opsforge scale deployment/opsforge-api --replicas=1   # A RESTAURER systematiquement</w:t>
+      </w:r>
+    </w:p>
+    <w:p>
+      <w:pPr>
+        <w:pStyle w:val="Titre2"/>
+      </w:pPr>
+      <w:bookmarkStart w:id="50" w:name="_Toc238464008"/>
+      <w:r>
+        <w:t>C.5 Sauvegarde et restauration</w:t>
+      </w:r>
+      <w:bookmarkEnd w:id="50"/>
+    </w:p>
+    <w:p>
+      <w:pPr>
+        <w:pStyle w:val="OFCode"/>
+        <w:keepNext/>
+        <w:pBdr>
+          <w:top w:val="single" w:sz="6" w:space="3" w:color="DDE5E8"/>
+          <w:left w:val="single" w:sz="18" w:space="3" w:color="0F766E"/>
+        </w:pBdr>
+        <w:shd w:val="clear" w:color="auto" w:fill="F4F7F8"/>
+        <w:spacing w:before="140"/>
+      </w:pPr>
+      <w:r>
+        <w:rPr>
+          <w:noProof/>
+          <w:lang w:val="en-US"/>
+        </w:rPr>
+        <w:t>.\scripts\backup.ps1</w:t>
+      </w:r>
+    </w:p>
+    <w:p>
+      <w:pPr>
+        <w:pStyle w:val="OFCode"/>
+        <w:pBdr>
+          <w:left w:val="single" w:sz="18" w:space="3" w:color="0F766E"/>
+          <w:bottom w:val="single" w:sz="6" w:space="3" w:color="DDE5E8"/>
+        </w:pBdr>
+        <w:shd w:val="clear" w:color="auto" w:fill="F4F7F8"/>
+        <w:spacing w:after="160"/>
+      </w:pPr>
+      <w:r>
+        <w:rPr>
+          <w:noProof/>
+          <w:lang w:val="en-US"/>
+        </w:rPr>
+        <w:t>.\scripts\restore.ps1 -BackupFile .\backups\opsforge_backup_AAAAMMJJ_HHMMSS.dump</w:t>
+      </w:r>
+    </w:p>
+    <w:p>
+      <w:r>
+        <w:t xml:space="preserve">Sans le drapeau </w:t>
+      </w:r>
+      <w:r>
+        <w:rPr>
+          <w:rFonts w:ascii="Consolas" w:eastAsia="Consolas" w:hAnsi="Consolas" w:cs="Consolas"/>
+          <w:noProof/>
+          <w:color w:val="0B3F3B"/>
+          <w:sz w:val="18"/>
+          <w:lang w:val="en-US"/>
+        </w:rPr>
+        <w:t>-MainDatabase</w:t>
+      </w:r>
+      <w:r>
+        <w:t xml:space="preserve">, la restauration se fait dans une base temporaire de vérification : la base principale n’est jamais touchée (§ 5.6). Enfin, le dépôt étant public, le run d’intégration continue du candidat final se consulte sans compte à l’adresse </w:t>
+      </w:r>
+      <w:r>
+        <w:rPr>
+          <w:rFonts w:ascii="Consolas" w:eastAsia="Consolas" w:hAnsi="Consolas" w:cs="Consolas"/>
+          <w:noProof/>
+          <w:color w:val="0B3F3B"/>
+          <w:sz w:val="18"/>
+          <w:lang w:val="en-US"/>
+        </w:rPr>
+        <w:t>github.com/ThDyllan/opsforge/actions/runs/32197168814</w:t>
+      </w:r>
+      <w:r>
+        <w:t xml:space="preserve"> (figure 11).</w:t>
+      </w:r>
+    </w:p>
+    <w:p>
+      <w:pPr>
+        <w:pStyle w:val="Titre1"/>
+        <w:pageBreakBefore/>
+        <w:pBdr>
+          <w:bottom w:val="single" w:sz="8" w:space="6" w:color="99C7C0"/>
+        </w:pBdr>
+      </w:pPr>
+      <w:bookmarkStart w:id="51" w:name="_Toc238464009"/>
+      <w:r>
+        <w:lastRenderedPageBreak/>
+        <w:t>Annexe D — Glossaire</w:t>
+      </w:r>
+      <w:bookmarkEnd w:id="51"/>
     </w:p>
     <w:tbl>
       <w:tblPr>
@@ -17624,8 +18869,8 @@
       </w:pPr>
     </w:p>
     <w:sectPr>
-      <w:headerReference w:type="default" r:id="rId20"/>
-      <w:footerReference w:type="default" r:id="rId21"/>
+      <w:headerReference w:type="default" r:id="rId22"/>
+      <w:footerReference w:type="default" r:id="rId23"/>
       <w:pgSz w:w="11906" w:h="16838"/>
       <w:pgMar w:top="1077" w:right="1247" w:bottom="964" w:left="1247" w:header="624" w:footer="567" w:gutter="0"/>
       <w:pgNumType w:start="1"/>
@@ -17942,31 +19187,31 @@
       </w:rPr>
     </w:lvl>
   </w:abstractNum>
-  <w:num w:numId="1" w16cid:durableId="1698458119">
+  <w:num w:numId="1" w16cid:durableId="1799450457">
     <w:abstractNumId w:val="8"/>
   </w:num>
-  <w:num w:numId="2" w16cid:durableId="357246342">
+  <w:num w:numId="2" w16cid:durableId="891501983">
     <w:abstractNumId w:val="6"/>
   </w:num>
-  <w:num w:numId="3" w16cid:durableId="996499797">
+  <w:num w:numId="3" w16cid:durableId="1059011626">
     <w:abstractNumId w:val="5"/>
   </w:num>
-  <w:num w:numId="4" w16cid:durableId="1760128607">
+  <w:num w:numId="4" w16cid:durableId="627976565">
     <w:abstractNumId w:val="4"/>
   </w:num>
-  <w:num w:numId="5" w16cid:durableId="1612055064">
+  <w:num w:numId="5" w16cid:durableId="388502382">
     <w:abstractNumId w:val="7"/>
   </w:num>
-  <w:num w:numId="6" w16cid:durableId="2053066693">
+  <w:num w:numId="6" w16cid:durableId="1377848776">
     <w:abstractNumId w:val="3"/>
   </w:num>
-  <w:num w:numId="7" w16cid:durableId="1433697509">
+  <w:num w:numId="7" w16cid:durableId="1477183630">
     <w:abstractNumId w:val="2"/>
   </w:num>
-  <w:num w:numId="8" w16cid:durableId="819732115">
+  <w:num w:numId="8" w16cid:durableId="2058815700">
     <w:abstractNumId w:val="1"/>
   </w:num>
-  <w:num w:numId="9" w16cid:durableId="238485848">
+  <w:num w:numId="9" w16cid:durableId="439379650">
     <w:abstractNumId w:val="0"/>
   </w:num>
 </w:numbering>
@@ -29446,7 +30691,7 @@
     <w:autoRedefine/>
     <w:uiPriority w:val="39"/>
     <w:unhideWhenUsed/>
-    <w:rsid w:val="004A18E1"/>
+    <w:rsid w:val="00006E61"/>
     <w:pPr>
       <w:spacing w:after="30" w:line="240" w:lineRule="auto"/>
     </w:pPr>
@@ -29461,7 +30706,7 @@
     <w:autoRedefine/>
     <w:uiPriority w:val="39"/>
     <w:unhideWhenUsed/>
-    <w:rsid w:val="004A18E1"/>
+    <w:rsid w:val="00006E61"/>
     <w:pPr>
       <w:spacing w:after="10" w:line="240" w:lineRule="auto"/>
       <w:ind w:left="220"/>
@@ -29475,7 +30720,7 @@
     <w:basedOn w:val="Policepardfaut"/>
     <w:uiPriority w:val="99"/>
     <w:unhideWhenUsed/>
-    <w:rsid w:val="004A18E1"/>
+    <w:rsid w:val="00006E61"/>
     <w:rPr>
       <w:color w:val="0000FF" w:themeColor="hyperlink"/>
       <w:u w:val="single"/>

</xml_diff>